<commit_message>
Added Html to webpages
</commit_message>
<xml_diff>
--- a/DOCUMENTS/Gloriosia_Gardens_Website_Proposal.docx
+++ b/DOCUMENTS/Gloriosia_Gardens_Website_Proposal.docx
@@ -1,82 +1,67 @@
 
 <file path=word/document.xml><?xml version="1.0" encoding="utf-8"?>
-<w:document xmlns:wpc="http://schemas.microsoft.com/office/word/2010/wordprocessingCanvas" xmlns:cx="http://schemas.microsoft.com/office/drawing/2014/chartex" xmlns:cx1="http://schemas.microsoft.com/office/drawing/2015/9/8/chartex" xmlns:cx2="http://schemas.microsoft.com/office/drawing/2015/10/21/chartex" xmlns:cx3="http://schemas.microsoft.com/office/drawing/2016/5/9/chartex" xmlns:cx4="http://schemas.microsoft.com/office/drawing/2016/5/10/chartex" xmlns:cx5="http://schemas.microsoft.com/office/drawing/2016/5/11/chartex" xmlns:cx6="http://schemas.microsoft.com/office/drawing/2016/5/12/chartex" xmlns:cx7="http://schemas.microsoft.com/office/drawing/2016/5/13/chartex" xmlns:cx8="http://schemas.microsoft.com/office/drawing/2016/5/14/chartex" xmlns:mc="http://schemas.openxmlformats.org/markup-compatibility/2006" xmlns:aink="http://schemas.microsoft.com/office/drawing/2016/ink" xmlns:am3d="http://schemas.microsoft.com/office/drawing/2017/model3d" xmlns:o="urn:schemas-microsoft-com:office:office" xmlns:oel="http://schemas.microsoft.com/office/2019/extlst" xmlns:r="http://schemas.openxmlformats.org/officeDocument/2006/relationships" xmlns:m="http://schemas.openxmlformats.org/officeDocument/2006/math" xmlns:v="urn:schemas-microsoft-com:vml" xmlns:wp14="http://schemas.microsoft.com/office/word/2010/wordprocessingDrawing" xmlns:wp="http://schemas.openxmlformats.org/drawingml/2006/wordprocessingDrawing" xmlns:w10="urn:schemas-microsoft-com:office:word" xmlns:w="http://schemas.openxmlformats.org/wordprocessingml/2006/main" xmlns:w14="http://schemas.microsoft.com/office/word/2010/wordml" xmlns:w15="http://schemas.microsoft.com/office/word/2012/wordml" xmlns:w16cei="http://schemas.microsoft.com/office/word/2026/wordml/cei" xmlns:w16cex="http://schemas.microsoft.com/office/word/2018/wordml/cex" xmlns:w16cid="http://schemas.microsoft.com/office/word/2016/wordml/cid" xmlns:w16="http://schemas.microsoft.com/office/word/2018/wordml" xmlns:w16du="http://schemas.microsoft.com/office/word/2023/wordml/word16du" xmlns:w16sdtdh="http://schemas.microsoft.com/office/word/2020/wordml/sdtdatahash" xmlns:w16sdtfl="http://schemas.microsoft.com/office/word/2024/wordml/sdtformatlock" xmlns:w16se="http://schemas.microsoft.com/office/word/2015/wordml/symex" xmlns:wpg="http://schemas.microsoft.com/office/word/2010/wordprocessingGroup" xmlns:wpi="http://schemas.microsoft.com/office/word/2010/wordprocessingInk" xmlns:wne="http://schemas.microsoft.com/office/word/2006/wordml" xmlns:wps="http://schemas.microsoft.com/office/word/2010/wordprocessingShape" mc:Ignorable="w14 w15 w16se w16cid w16 w16cex w16sdtdh w16sdtfl w16du wp14">
+<w:document xmlns:wpc="http://schemas.microsoft.com/office/word/2010/wordprocessingCanvas" xmlns:cx="http://schemas.microsoft.com/office/drawing/2014/chartex" xmlns:cx1="http://schemas.microsoft.com/office/drawing/2015/9/8/chartex" xmlns:cx2="http://schemas.microsoft.com/office/drawing/2015/10/21/chartex" xmlns:cx3="http://schemas.microsoft.com/office/drawing/2016/5/9/chartex" xmlns:cx4="http://schemas.microsoft.com/office/drawing/2016/5/10/chartex" xmlns:cx5="http://schemas.microsoft.com/office/drawing/2016/5/11/chartex" xmlns:cx6="http://schemas.microsoft.com/office/drawing/2016/5/12/chartex" xmlns:cx7="http://schemas.microsoft.com/office/drawing/2016/5/13/chartex" xmlns:cx8="http://schemas.microsoft.com/office/drawing/2016/5/14/chartex" xmlns:mc="http://schemas.openxmlformats.org/markup-compatibility/2006" xmlns:aink="http://schemas.microsoft.com/office/drawing/2016/ink" xmlns:am3d="http://schemas.microsoft.com/office/drawing/2017/model3d" xmlns:o="urn:schemas-microsoft-com:office:office" xmlns:oel="http://schemas.microsoft.com/office/2019/extlst" xmlns:r="http://schemas.openxmlformats.org/officeDocument/2006/relationships" xmlns:m="http://schemas.openxmlformats.org/officeDocument/2006/math" xmlns:v="urn:schemas-microsoft-com:vml" xmlns:wp14="http://schemas.microsoft.com/office/word/2010/wordprocessingDrawing" xmlns:wp="http://schemas.openxmlformats.org/drawingml/2006/wordprocessingDrawing" xmlns:w10="urn:schemas-microsoft-com:office:word" xmlns:w="http://schemas.openxmlformats.org/wordprocessingml/2006/main" xmlns:w14="http://schemas.microsoft.com/office/word/2010/wordml" xmlns:w15="http://schemas.microsoft.com/office/word/2012/wordml" xmlns:w16cex="http://schemas.microsoft.com/office/word/2018/wordml/cex" xmlns:w16cid="http://schemas.microsoft.com/office/word/2016/wordml/cid" xmlns:w16="http://schemas.microsoft.com/office/word/2018/wordml" xmlns:w16du="http://schemas.microsoft.com/office/word/2023/wordml/word16du" xmlns:w16sdtdh="http://schemas.microsoft.com/office/word/2020/wordml/sdtdatahash" xmlns:w16sdtfl="http://schemas.microsoft.com/office/word/2024/wordml/sdtformatlock" xmlns:w16se="http://schemas.microsoft.com/office/word/2015/wordml/symex" xmlns:wpg="http://schemas.microsoft.com/office/word/2010/wordprocessingGroup" xmlns:wpi="http://schemas.microsoft.com/office/word/2010/wordprocessingInk" xmlns:wne="http://schemas.microsoft.com/office/word/2006/wordml" xmlns:wps="http://schemas.microsoft.com/office/word/2010/wordprocessingShape" mc:Ignorable="w14 w15 w16se w16cid w16 w16cex w16sdtdh w16sdtfl w16du wp14">
   <w:body>
     <w:p>
       <w:pPr>
-        <w:spacing w:before="2000"/>
-      </w:pPr>
-    </w:p>
-    <w:p>
-      <w:pPr>
+        <w:pStyle w:val="Heading1"/>
+        <w:jc w:val="center"/>
+      </w:pPr>
+    </w:p>
+    <w:p>
+      <w:pPr>
+        <w:pStyle w:val="Heading1"/>
         <w:jc w:val="center"/>
       </w:pPr>
       <w:r>
         <w:rPr>
           <w:b/>
           <w:bCs/>
-          <w:sz w:val="40"/>
-          <w:szCs w:val="40"/>
         </w:rPr>
         <w:t>Website Project Proposal</w:t>
       </w:r>
     </w:p>
     <w:p>
       <w:pPr>
-        <w:spacing w:before="200"/>
+        <w:pStyle w:val="Heading2"/>
         <w:jc w:val="center"/>
       </w:pPr>
-      <w:r>
-        <w:rPr>
-          <w:sz w:val="28"/>
-          <w:szCs w:val="28"/>
-        </w:rPr>
-        <w:t xml:space="preserve">Prepared for: </w:t>
-      </w:r>
       <w:proofErr w:type="spellStart"/>
       <w:r>
-        <w:rPr>
-          <w:sz w:val="28"/>
-          <w:szCs w:val="28"/>
-        </w:rPr>
         <w:t>Gloriosia</w:t>
       </w:r>
       <w:proofErr w:type="spellEnd"/>
       <w:r>
-        <w:rPr>
-          <w:sz w:val="28"/>
-          <w:szCs w:val="28"/>
-        </w:rPr>
         <w:t xml:space="preserve"> </w:t>
       </w:r>
       <w:r>
-        <w:rPr>
-          <w:sz w:val="28"/>
-          <w:szCs w:val="28"/>
-        </w:rPr>
-        <w:t xml:space="preserve">Gardens </w:t>
-      </w:r>
-    </w:p>
-    <w:p>
-      <w:pPr>
+        <w:t>Gardens</w:t>
+      </w:r>
+    </w:p>
+    <w:p>
+      <w:pPr>
+        <w:pStyle w:val="Heading2"/>
         <w:jc w:val="center"/>
       </w:pPr>
       <w:r>
+        <w:t>DISD0601-Year 1-GR 1</w:t>
+      </w:r>
+    </w:p>
+    <w:p>
+      <w:pPr>
+        <w:pStyle w:val="Heading2"/>
+        <w:jc w:val="center"/>
+      </w:pPr>
+      <w:r>
         <w:t xml:space="preserve">Web Development – </w:t>
       </w:r>
       <w:r>
-        <w:t>WE</w:t>
-      </w:r>
-      <w:r>
-        <w:t>D</w:t>
-      </w:r>
-      <w:r>
-        <w:t>E5020</w:t>
-      </w:r>
-    </w:p>
-    <w:p>
-      <w:pPr>
-        <w:spacing w:before="120"/>
+        <w:t>WEDE5020</w:t>
+      </w:r>
+    </w:p>
+    <w:p>
+      <w:pPr>
+        <w:pStyle w:val="Heading2"/>
         <w:jc w:val="center"/>
       </w:pPr>
       <w:r>
@@ -85,7 +70,7 @@
     </w:p>
     <w:p>
       <w:pPr>
-        <w:spacing w:before="120"/>
+        <w:pStyle w:val="Heading2"/>
         <w:jc w:val="center"/>
       </w:pPr>
       <w:r>
@@ -97,112 +82,127 @@
     </w:p>
     <w:p>
       <w:pPr>
-        <w:spacing w:before="120"/>
+        <w:pStyle w:val="Heading2"/>
         <w:jc w:val="center"/>
       </w:pPr>
-      <w:r>
-        <w:t xml:space="preserve">Group: </w:t>
-      </w:r>
-      <w:r>
-        <w:t>1</w:t>
-      </w:r>
-    </w:p>
-    <w:p>
-      <w:pPr>
-        <w:spacing w:before="120"/>
-        <w:jc w:val="center"/>
-      </w:pPr>
-    </w:p>
-    <w:p>
-      <w:r>
+    </w:p>
+    <w:p>
+      <w:pPr>
+        <w:rPr>
+          <w:rFonts w:ascii="Calibri" w:hAnsi="Calibri" w:cs="Calibri"/>
+        </w:rPr>
+      </w:pPr>
+      <w:r>
+        <w:rPr>
+          <w:rFonts w:ascii="Calibri" w:hAnsi="Calibri" w:cs="Calibri"/>
+        </w:rPr>
         <w:br w:type="page"/>
       </w:r>
     </w:p>
     <w:p>
       <w:pPr>
         <w:pStyle w:val="Heading1"/>
-        <w:spacing w:before="300" w:after="160"/>
-      </w:pPr>
-      <w:r>
-        <w:rPr>
-          <w:b/>
-          <w:bCs/>
-        </w:rPr>
+      </w:pPr>
+      <w:r>
         <w:lastRenderedPageBreak/>
         <w:t xml:space="preserve"> Organisation Overview</w:t>
       </w:r>
     </w:p>
     <w:p>
       <w:pPr>
+        <w:pStyle w:val="Heading2"/>
+      </w:pPr>
+      <w:r>
+        <w:t>Name</w:t>
+      </w:r>
+    </w:p>
+    <w:p>
+      <w:pPr>
+        <w:spacing w:after="160" w:line="360" w:lineRule="exact"/>
+        <w:rPr>
+          <w:rFonts w:ascii="Calibri" w:hAnsi="Calibri" w:cs="Calibri"/>
+        </w:rPr>
+      </w:pPr>
+      <w:r>
+        <w:rPr>
+          <w:rFonts w:ascii="Calibri" w:hAnsi="Calibri" w:cs="Calibri"/>
+          <w:color w:val="222222"/>
+        </w:rPr>
+        <w:t>Gloriosa Gardens</w:t>
+      </w:r>
+    </w:p>
+    <w:p>
+      <w:pPr>
+        <w:pStyle w:val="Heading2"/>
+      </w:pPr>
+      <w:r>
+        <w:t>Brief History</w:t>
+      </w:r>
+    </w:p>
+    <w:p>
+      <w:pPr>
+        <w:spacing w:after="160" w:line="360" w:lineRule="exact"/>
+        <w:rPr>
+          <w:rFonts w:ascii="Calibri" w:hAnsi="Calibri" w:cs="Calibri"/>
+        </w:rPr>
+      </w:pPr>
+      <w:r>
+        <w:rPr>
+          <w:rFonts w:ascii="Calibri" w:hAnsi="Calibri" w:cs="Calibri"/>
+          <w:color w:val="222222"/>
+        </w:rPr>
+        <w:t>Gloriosa Gardens is a garden maintenance and design business founded roughly 25 years ago in Florida, Roodepoort. It has grown almost entirely through word of mouth and client referrals, building a reputation for reliable, hands-on garden care. The business is run by owner Richard Lyall, supported by a small team of three: a garden and outdoor designer, a maintenance specialist, and a main gardener.</w:t>
+      </w:r>
+    </w:p>
+    <w:p>
+      <w:pPr>
+        <w:pStyle w:val="Heading2"/>
+      </w:pPr>
+      <w:r>
+        <w:t>Mission</w:t>
+      </w:r>
+    </w:p>
+    <w:p>
+      <w:pPr>
         <w:spacing w:after="160" w:line="360" w:lineRule="auto"/>
-      </w:pPr>
-      <w:proofErr w:type="spellStart"/>
-      <w:r>
-        <w:t>Gloriosia</w:t>
-      </w:r>
-      <w:proofErr w:type="spellEnd"/>
-      <w:r>
-        <w:t xml:space="preserve"> Gardens is a</w:t>
-      </w:r>
-      <w:r>
-        <w:t xml:space="preserve"> g</w:t>
-      </w:r>
-      <w:r>
-        <w:t>arden maintenance and garden design business, offering lawn care, planting, seasonal upkeep, and full garden redesigns to residential clients.</w:t>
+        <w:rPr>
+          <w:rFonts w:ascii="Calibri" w:hAnsi="Calibri" w:cs="Calibri"/>
+        </w:rPr>
+      </w:pPr>
+      <w:r>
+        <w:rPr>
+          <w:rFonts w:ascii="Calibri" w:hAnsi="Calibri" w:cs="Calibri"/>
+        </w:rPr>
+        <w:t>To help clients enjoy healthier, more beautiful outdoor spaces through reliable maintenance and thoughtful, personalised garden design.</w:t>
       </w:r>
     </w:p>
     <w:p>
       <w:pPr>
         <w:pStyle w:val="Heading2"/>
-        <w:spacing w:before="200" w:after="120"/>
-      </w:pPr>
-      <w:r>
-        <w:rPr>
-          <w:b/>
-          <w:bCs/>
-        </w:rPr>
-        <w:t>Mission</w:t>
+      </w:pPr>
+      <w:r>
+        <w:t>Vision</w:t>
       </w:r>
     </w:p>
     <w:p>
       <w:pPr>
         <w:spacing w:after="160" w:line="360" w:lineRule="auto"/>
-      </w:pPr>
-      <w:r>
-        <w:t>To help clients enjoy healthier, more beautiful outdoor spaces through reliable maintenance and thoughtful, personalised garden design.</w:t>
+        <w:rPr>
+          <w:rFonts w:ascii="Calibri" w:hAnsi="Calibri" w:cs="Calibri"/>
+        </w:rPr>
+      </w:pPr>
+      <w:r>
+        <w:rPr>
+          <w:rFonts w:ascii="Calibri" w:hAnsi="Calibri" w:cs="Calibri"/>
+        </w:rPr>
+        <w:t>To become the most trusted garden care and design service in the local area, known for quality work and lasting client relationships.</w:t>
       </w:r>
     </w:p>
     <w:p>
       <w:pPr>
         <w:pStyle w:val="Heading2"/>
-        <w:spacing w:before="200" w:after="120"/>
-      </w:pPr>
-      <w:r>
-        <w:rPr>
-          <w:b/>
-          <w:bCs/>
-        </w:rPr>
-        <w:t>Vision</w:t>
-      </w:r>
-    </w:p>
-    <w:p>
-      <w:pPr>
-        <w:spacing w:after="160" w:line="360" w:lineRule="auto"/>
-      </w:pPr>
-      <w:r>
-        <w:t>To become the most trusted garden care and design service in the local area, known for quality work and lasting client relationships.</w:t>
-      </w:r>
-    </w:p>
-    <w:p>
-      <w:pPr>
-        <w:pStyle w:val="Heading2"/>
-        <w:spacing w:before="200" w:after="120"/>
-      </w:pPr>
-      <w:r>
-        <w:rPr>
-          <w:b/>
-          <w:bCs/>
-        </w:rPr>
+      </w:pPr>
+      <w:r>
         <w:t>Target Audience</w:t>
       </w:r>
     </w:p>
@@ -214,8 +214,14 @@
           <w:numId w:val="2"/>
         </w:numPr>
         <w:spacing w:after="80" w:line="360" w:lineRule="auto"/>
-      </w:pPr>
-      <w:r>
+        <w:rPr>
+          <w:rFonts w:ascii="Calibri" w:hAnsi="Calibri" w:cs="Calibri"/>
+        </w:rPr>
+      </w:pPr>
+      <w:r>
+        <w:rPr>
+          <w:rFonts w:ascii="Calibri" w:hAnsi="Calibri" w:cs="Calibri"/>
+        </w:rPr>
         <w:t>Homeowners wanting regular garden maintenance</w:t>
       </w:r>
     </w:p>
@@ -227,8 +233,14 @@
           <w:numId w:val="2"/>
         </w:numPr>
         <w:spacing w:after="80" w:line="360" w:lineRule="auto"/>
-      </w:pPr>
-      <w:r>
+        <w:rPr>
+          <w:rFonts w:ascii="Calibri" w:hAnsi="Calibri" w:cs="Calibri"/>
+        </w:rPr>
+      </w:pPr>
+      <w:r>
+        <w:rPr>
+          <w:rFonts w:ascii="Calibri" w:hAnsi="Calibri" w:cs="Calibri"/>
+        </w:rPr>
         <w:t>Homeowners planning a garden redesign or renovation</w:t>
       </w:r>
     </w:p>
@@ -240,50 +252,101 @@
           <w:numId w:val="2"/>
         </w:numPr>
         <w:spacing w:after="80" w:line="360" w:lineRule="auto"/>
-      </w:pPr>
-      <w:r>
+        <w:rPr>
+          <w:rFonts w:ascii="Calibri" w:hAnsi="Calibri" w:cs="Calibri"/>
+        </w:rPr>
+      </w:pPr>
+      <w:r>
+        <w:rPr>
+          <w:rFonts w:ascii="Calibri" w:hAnsi="Calibri" w:cs="Calibri"/>
+        </w:rPr>
         <w:t>Small businesses or estates needing ongoing grounds care</w:t>
       </w:r>
     </w:p>
     <w:p>
       <w:pPr>
         <w:pStyle w:val="Heading1"/>
-        <w:spacing w:before="300" w:after="160"/>
-      </w:pPr>
-      <w:r>
-        <w:rPr>
-          <w:b/>
-          <w:bCs/>
-        </w:rPr>
-        <w:t>2. Website Goals and Objectives</w:t>
-      </w:r>
-    </w:p>
-    <w:p>
-      <w:pPr>
-        <w:spacing w:after="160" w:line="360" w:lineRule="auto"/>
-      </w:pPr>
-      <w:r>
-        <w:t xml:space="preserve">The website's primary goal is to generate new client enquiries and showcase </w:t>
-      </w:r>
-      <w:proofErr w:type="spellStart"/>
-      <w:r>
-        <w:t>Gloriosia</w:t>
-      </w:r>
-      <w:proofErr w:type="spellEnd"/>
-      <w:r>
-        <w:t xml:space="preserve"> Gardens' completed work, replacing the current reliance on word-of-mouth referrals.</w:t>
+      </w:pPr>
+      <w:r>
+        <w:t>Website Goals and Objectives</w:t>
       </w:r>
     </w:p>
     <w:p>
       <w:pPr>
         <w:pStyle w:val="Heading2"/>
-        <w:spacing w:before="200" w:after="120"/>
-      </w:pPr>
-      <w:r>
-        <w:rPr>
-          <w:b/>
-          <w:bCs/>
-        </w:rPr>
+      </w:pPr>
+      <w:r>
+        <w:t>Goals</w:t>
+      </w:r>
+    </w:p>
+    <w:p>
+      <w:pPr>
+        <w:pStyle w:val="ListParagraph"/>
+        <w:numPr>
+          <w:ilvl w:val="0"/>
+          <w:numId w:val="3"/>
+        </w:numPr>
+        <w:suppressAutoHyphens/>
+        <w:spacing w:after="80" w:line="360" w:lineRule="exact"/>
+        <w:rPr>
+          <w:rFonts w:ascii="Calibri" w:hAnsi="Calibri" w:cs="Calibri"/>
+        </w:rPr>
+      </w:pPr>
+      <w:r>
+        <w:rPr>
+          <w:rFonts w:ascii="Calibri" w:hAnsi="Calibri" w:cs="Calibri"/>
+          <w:color w:val="222222"/>
+        </w:rPr>
+        <w:t>Establish a credible, professional online presence to support a business that has relied on word of mouth.</w:t>
+      </w:r>
+    </w:p>
+    <w:p>
+      <w:pPr>
+        <w:pStyle w:val="ListParagraph"/>
+        <w:numPr>
+          <w:ilvl w:val="0"/>
+          <w:numId w:val="3"/>
+        </w:numPr>
+        <w:suppressAutoHyphens/>
+        <w:spacing w:after="80" w:line="360" w:lineRule="exact"/>
+        <w:rPr>
+          <w:rFonts w:ascii="Calibri" w:hAnsi="Calibri" w:cs="Calibri"/>
+        </w:rPr>
+      </w:pPr>
+      <w:r>
+        <w:rPr>
+          <w:rFonts w:ascii="Calibri" w:hAnsi="Calibri" w:cs="Calibri"/>
+          <w:color w:val="222222"/>
+        </w:rPr>
+        <w:t>Generate qualified leads by making it easy for visitors to request a quote.</w:t>
+      </w:r>
+    </w:p>
+    <w:p>
+      <w:pPr>
+        <w:pStyle w:val="ListParagraph"/>
+        <w:numPr>
+          <w:ilvl w:val="0"/>
+          <w:numId w:val="3"/>
+        </w:numPr>
+        <w:suppressAutoHyphens/>
+        <w:spacing w:after="80" w:line="360" w:lineRule="exact"/>
+        <w:rPr>
+          <w:rFonts w:ascii="Calibri" w:hAnsi="Calibri" w:cs="Calibri"/>
+        </w:rPr>
+      </w:pPr>
+      <w:r>
+        <w:rPr>
+          <w:rFonts w:ascii="Calibri" w:hAnsi="Calibri" w:cs="Calibri"/>
+          <w:color w:val="222222"/>
+        </w:rPr>
+        <w:t>Clearly communicate the range of services offered and showcase the quality of past work.</w:t>
+      </w:r>
+    </w:p>
+    <w:p>
+      <w:pPr>
+        <w:pStyle w:val="Heading2"/>
+      </w:pPr>
+      <w:r>
         <w:t>Key Performance Indicators (KPIs)</w:t>
       </w:r>
     </w:p>
@@ -295,8 +358,14 @@
           <w:numId w:val="2"/>
         </w:numPr>
         <w:spacing w:after="80" w:line="360" w:lineRule="auto"/>
-      </w:pPr>
-      <w:r>
+        <w:rPr>
+          <w:rFonts w:ascii="Calibri" w:hAnsi="Calibri" w:cs="Calibri"/>
+        </w:rPr>
+      </w:pPr>
+      <w:r>
+        <w:rPr>
+          <w:rFonts w:ascii="Calibri" w:hAnsi="Calibri" w:cs="Calibri"/>
+        </w:rPr>
         <w:t>Number of enquiry form submissions per month</w:t>
       </w:r>
     </w:p>
@@ -308,8 +377,14 @@
           <w:numId w:val="2"/>
         </w:numPr>
         <w:spacing w:after="80" w:line="360" w:lineRule="auto"/>
-      </w:pPr>
-      <w:r>
+        <w:rPr>
+          <w:rFonts w:ascii="Calibri" w:hAnsi="Calibri" w:cs="Calibri"/>
+        </w:rPr>
+      </w:pPr>
+      <w:r>
+        <w:rPr>
+          <w:rFonts w:ascii="Calibri" w:hAnsi="Calibri" w:cs="Calibri"/>
+        </w:rPr>
         <w:t>Website visitor traffic (monthly unique visitors)</w:t>
       </w:r>
     </w:p>
@@ -321,8 +396,14 @@
           <w:numId w:val="2"/>
         </w:numPr>
         <w:spacing w:after="80" w:line="360" w:lineRule="auto"/>
-      </w:pPr>
-      <w:r>
+        <w:rPr>
+          <w:rFonts w:ascii="Calibri" w:hAnsi="Calibri" w:cs="Calibri"/>
+        </w:rPr>
+      </w:pPr>
+      <w:r>
+        <w:rPr>
+          <w:rFonts w:ascii="Calibri" w:hAnsi="Calibri" w:cs="Calibri"/>
+        </w:rPr>
         <w:t>Click-through rate on the "Get a Quote" call-to-action</w:t>
       </w:r>
     </w:p>
@@ -334,48 +415,116 @@
           <w:numId w:val="2"/>
         </w:numPr>
         <w:spacing w:after="80" w:line="360" w:lineRule="auto"/>
-      </w:pPr>
-      <w:r>
+        <w:rPr>
+          <w:rFonts w:ascii="Calibri" w:hAnsi="Calibri" w:cs="Calibri"/>
+        </w:rPr>
+      </w:pPr>
+      <w:r>
+        <w:rPr>
+          <w:rFonts w:ascii="Calibri" w:hAnsi="Calibri" w:cs="Calibri"/>
+        </w:rPr>
         <w:t>Portfolio/gallery page views</w:t>
       </w:r>
     </w:p>
     <w:p>
       <w:pPr>
+        <w:rPr>
+          <w:color w:val="000000" w:themeColor="text1"/>
+          <w:sz w:val="32"/>
+          <w:szCs w:val="32"/>
+        </w:rPr>
+      </w:pPr>
+      <w:r>
+        <w:br w:type="page"/>
+      </w:r>
+    </w:p>
+    <w:p>
+      <w:pPr>
         <w:pStyle w:val="Heading1"/>
-        <w:spacing w:before="300" w:after="160"/>
-      </w:pPr>
-      <w:r>
-        <w:rPr>
-          <w:b/>
-          <w:bCs/>
-        </w:rPr>
-        <w:t>3. Current Website Analysis</w:t>
+      </w:pPr>
+      <w:r>
+        <w:lastRenderedPageBreak/>
+        <w:t>Current Website Analysis</w:t>
       </w:r>
     </w:p>
     <w:p>
       <w:pPr>
         <w:spacing w:after="160" w:line="360" w:lineRule="auto"/>
+        <w:rPr>
+          <w:rFonts w:ascii="Calibri" w:hAnsi="Calibri" w:cs="Calibri"/>
+        </w:rPr>
       </w:pPr>
       <w:proofErr w:type="spellStart"/>
       <w:r>
+        <w:rPr>
+          <w:rFonts w:ascii="Calibri" w:hAnsi="Calibri" w:cs="Calibri"/>
+        </w:rPr>
         <w:t>Gloriosia</w:t>
       </w:r>
       <w:proofErr w:type="spellEnd"/>
       <w:r>
+        <w:rPr>
+          <w:rFonts w:ascii="Calibri" w:hAnsi="Calibri" w:cs="Calibri"/>
+        </w:rPr>
         <w:t xml:space="preserve"> Gardens does not currently have a website and relies on a Facebook page for visibility.</w:t>
       </w:r>
     </w:p>
     <w:p>
       <w:pPr>
         <w:pStyle w:val="Heading2"/>
-        <w:spacing w:before="200" w:after="120"/>
-      </w:pPr>
-      <w:r>
-        <w:rPr>
-          <w:b/>
-          <w:bCs/>
-        </w:rPr>
+      </w:pPr>
+      <w:r>
         <w:t>Strengths</w:t>
+      </w:r>
+    </w:p>
+    <w:p>
+      <w:pPr>
+        <w:pStyle w:val="ListParagraph"/>
+        <w:numPr>
+          <w:ilvl w:val="0"/>
+          <w:numId w:val="3"/>
+        </w:numPr>
+        <w:suppressAutoHyphens/>
+        <w:spacing w:after="80" w:line="360" w:lineRule="exact"/>
+        <w:rPr>
+          <w:rFonts w:ascii="Calibri" w:hAnsi="Calibri" w:cs="Calibri"/>
+        </w:rPr>
+      </w:pPr>
+      <w:r>
+        <w:rPr>
+          <w:rFonts w:ascii="Calibri" w:hAnsi="Calibri" w:cs="Calibri"/>
+          <w:color w:val="222222"/>
+        </w:rPr>
+        <w:t>Existing photography and video of completed garden work was available to reuse.</w:t>
+      </w:r>
+    </w:p>
+    <w:p>
+      <w:pPr>
+        <w:pStyle w:val="ListParagraph"/>
+        <w:numPr>
+          <w:ilvl w:val="0"/>
+          <w:numId w:val="3"/>
+        </w:numPr>
+        <w:suppressAutoHyphens/>
+        <w:spacing w:after="80" w:line="360" w:lineRule="exact"/>
+        <w:rPr>
+          <w:rFonts w:ascii="Calibri" w:hAnsi="Calibri" w:cs="Calibri"/>
+        </w:rPr>
+      </w:pPr>
+      <w:r>
+        <w:rPr>
+          <w:rFonts w:ascii="Calibri" w:hAnsi="Calibri" w:cs="Calibri"/>
+          <w:color w:val="222222"/>
+        </w:rPr>
+        <w:t>Clear, simple service offering that is easy to communicate to visitors.</w:t>
+      </w:r>
+    </w:p>
+    <w:p>
+      <w:pPr>
+        <w:pStyle w:val="Heading2"/>
+      </w:pPr>
+      <w:r>
+        <w:t>Weaknesses</w:t>
       </w:r>
     </w:p>
     <w:p>
@@ -386,23 +535,15 @@
           <w:numId w:val="2"/>
         </w:numPr>
         <w:spacing w:after="80" w:line="360" w:lineRule="auto"/>
-      </w:pPr>
-      <w:r>
-        <w:t>Existing Facebook page has genuine client reviews and photos</w:t>
-      </w:r>
-    </w:p>
-    <w:p>
-      <w:pPr>
-        <w:pStyle w:val="Heading2"/>
-        <w:spacing w:before="200" w:after="120"/>
-      </w:pPr>
-      <w:r>
-        <w:rPr>
-          <w:b/>
-          <w:bCs/>
-        </w:rPr>
-        <w:lastRenderedPageBreak/>
-        <w:t>Weaknesses</w:t>
+        <w:rPr>
+          <w:rFonts w:ascii="Calibri" w:hAnsi="Calibri" w:cs="Calibri"/>
+        </w:rPr>
+      </w:pPr>
+      <w:r>
+        <w:rPr>
+          <w:rFonts w:ascii="Calibri" w:hAnsi="Calibri" w:cs="Calibri"/>
+        </w:rPr>
+        <w:t>No dedicated website means the business is hard to find via search engines</w:t>
       </w:r>
     </w:p>
     <w:p>
@@ -413,9 +554,15 @@
           <w:numId w:val="2"/>
         </w:numPr>
         <w:spacing w:after="80" w:line="360" w:lineRule="auto"/>
-      </w:pPr>
-      <w:r>
-        <w:t>No dedicated website means the business is hard to find via search engines</w:t>
+        <w:rPr>
+          <w:rFonts w:ascii="Calibri" w:hAnsi="Calibri" w:cs="Calibri"/>
+        </w:rPr>
+      </w:pPr>
+      <w:r>
+        <w:rPr>
+          <w:rFonts w:ascii="Calibri" w:hAnsi="Calibri" w:cs="Calibri"/>
+        </w:rPr>
+        <w:t>No structured way for visitors to request a quote</w:t>
       </w:r>
     </w:p>
     <w:p>
@@ -426,9 +573,1700 @@
           <w:numId w:val="2"/>
         </w:numPr>
         <w:spacing w:after="80" w:line="360" w:lineRule="auto"/>
-      </w:pPr>
-      <w:r>
-        <w:t>No structured way for visitors to request a quote</w:t>
+        <w:rPr>
+          <w:rFonts w:ascii="Calibri" w:hAnsi="Calibri" w:cs="Calibri"/>
+        </w:rPr>
+      </w:pPr>
+      <w:r>
+        <w:rPr>
+          <w:rFonts w:ascii="Calibri" w:hAnsi="Calibri" w:cs="Calibri"/>
+        </w:rPr>
+        <w:t>No central place to showcase a full portfolio of past projects</w:t>
+      </w:r>
+    </w:p>
+    <w:p>
+      <w:pPr>
+        <w:pStyle w:val="Heading2"/>
+      </w:pPr>
+      <w:r>
+        <w:t>Areas for Improvement</w:t>
+      </w:r>
+    </w:p>
+    <w:p>
+      <w:pPr>
+        <w:pStyle w:val="ListParagraph"/>
+        <w:numPr>
+          <w:ilvl w:val="0"/>
+          <w:numId w:val="3"/>
+        </w:numPr>
+        <w:suppressAutoHyphens/>
+        <w:spacing w:after="80" w:line="360" w:lineRule="exact"/>
+        <w:rPr>
+          <w:rFonts w:ascii="Calibri" w:hAnsi="Calibri" w:cs="Calibri"/>
+        </w:rPr>
+      </w:pPr>
+      <w:r>
+        <w:rPr>
+          <w:rFonts w:ascii="Calibri" w:hAnsi="Calibri" w:cs="Calibri"/>
+          <w:color w:val="222222"/>
+        </w:rPr>
+        <w:t>Introduce a consistent design system (colour, type, layout) applied via a shared stylesheet.</w:t>
+      </w:r>
+    </w:p>
+    <w:p>
+      <w:pPr>
+        <w:pStyle w:val="ListParagraph"/>
+        <w:numPr>
+          <w:ilvl w:val="0"/>
+          <w:numId w:val="3"/>
+        </w:numPr>
+        <w:suppressAutoHyphens/>
+        <w:spacing w:after="80" w:line="360" w:lineRule="exact"/>
+        <w:rPr>
+          <w:rFonts w:ascii="Calibri" w:hAnsi="Calibri" w:cs="Calibri"/>
+        </w:rPr>
+      </w:pPr>
+      <w:r>
+        <w:rPr>
+          <w:rFonts w:ascii="Calibri" w:hAnsi="Calibri" w:cs="Calibri"/>
+          <w:color w:val="222222"/>
+        </w:rPr>
+        <w:t>Fix navigation and structural HTML issues so every page links correctly.</w:t>
+      </w:r>
+    </w:p>
+    <w:p>
+      <w:pPr>
+        <w:pStyle w:val="ListParagraph"/>
+        <w:numPr>
+          <w:ilvl w:val="0"/>
+          <w:numId w:val="3"/>
+        </w:numPr>
+        <w:suppressAutoHyphens/>
+        <w:spacing w:after="80" w:line="360" w:lineRule="exact"/>
+        <w:rPr>
+          <w:rFonts w:ascii="Calibri" w:hAnsi="Calibri" w:cs="Calibri"/>
+        </w:rPr>
+      </w:pPr>
+      <w:r>
+        <w:rPr>
+          <w:rFonts w:ascii="Calibri" w:hAnsi="Calibri" w:cs="Calibri"/>
+          <w:color w:val="222222"/>
+        </w:rPr>
+        <w:t>Add a dedicated enquiry/quote-request mechanism to convert visitors into leads.</w:t>
+      </w:r>
+    </w:p>
+    <w:p>
+      <w:pPr>
+        <w:pStyle w:val="Heading1"/>
+      </w:pPr>
+      <w:r>
+        <w:t>Proposed Website Features and Functionality</w:t>
+      </w:r>
+    </w:p>
+    <w:p>
+      <w:pPr>
+        <w:pStyle w:val="ListParagraph"/>
+        <w:numPr>
+          <w:ilvl w:val="0"/>
+          <w:numId w:val="3"/>
+        </w:numPr>
+        <w:suppressAutoHyphens/>
+        <w:spacing w:after="80" w:line="360" w:lineRule="exact"/>
+        <w:rPr>
+          <w:rFonts w:ascii="Calibri" w:hAnsi="Calibri" w:cs="Calibri"/>
+        </w:rPr>
+      </w:pPr>
+      <w:r>
+        <w:rPr>
+          <w:rFonts w:ascii="Calibri" w:hAnsi="Calibri" w:cs="Calibri"/>
+          <w:color w:val="222222"/>
+        </w:rPr>
+        <w:t>Homepage — introduction, key selling points, and a call to action to request a quote.</w:t>
+      </w:r>
+    </w:p>
+    <w:p>
+      <w:pPr>
+        <w:pStyle w:val="ListParagraph"/>
+        <w:numPr>
+          <w:ilvl w:val="0"/>
+          <w:numId w:val="3"/>
+        </w:numPr>
+        <w:suppressAutoHyphens/>
+        <w:spacing w:after="80" w:line="360" w:lineRule="exact"/>
+        <w:rPr>
+          <w:rFonts w:ascii="Calibri" w:hAnsi="Calibri" w:cs="Calibri"/>
+        </w:rPr>
+      </w:pPr>
+      <w:r>
+        <w:rPr>
+          <w:rFonts w:ascii="Calibri" w:hAnsi="Calibri" w:cs="Calibri"/>
+          <w:color w:val="222222"/>
+        </w:rPr>
+        <w:t>About Us — business history, mission and vision, service area, and team profiles.</w:t>
+      </w:r>
+    </w:p>
+    <w:p>
+      <w:pPr>
+        <w:pStyle w:val="ListParagraph"/>
+        <w:numPr>
+          <w:ilvl w:val="0"/>
+          <w:numId w:val="3"/>
+        </w:numPr>
+        <w:suppressAutoHyphens/>
+        <w:spacing w:after="80" w:line="360" w:lineRule="exact"/>
+        <w:rPr>
+          <w:rFonts w:ascii="Calibri" w:hAnsi="Calibri" w:cs="Calibri"/>
+        </w:rPr>
+      </w:pPr>
+      <w:r>
+        <w:rPr>
+          <w:rFonts w:ascii="Calibri" w:hAnsi="Calibri" w:cs="Calibri"/>
+          <w:color w:val="222222"/>
+        </w:rPr>
+        <w:t>Services — maintenance, plant care, and clean-up packages with a clear process explanation.</w:t>
+      </w:r>
+    </w:p>
+    <w:p>
+      <w:pPr>
+        <w:pStyle w:val="ListParagraph"/>
+        <w:numPr>
+          <w:ilvl w:val="0"/>
+          <w:numId w:val="3"/>
+        </w:numPr>
+        <w:suppressAutoHyphens/>
+        <w:spacing w:after="80" w:line="360" w:lineRule="exact"/>
+        <w:rPr>
+          <w:rFonts w:ascii="Calibri" w:hAnsi="Calibri" w:cs="Calibri"/>
+        </w:rPr>
+      </w:pPr>
+      <w:r>
+        <w:rPr>
+          <w:rFonts w:ascii="Calibri" w:hAnsi="Calibri" w:cs="Calibri"/>
+          <w:color w:val="222222"/>
+        </w:rPr>
+        <w:t>Gallery — photo and video showcase of completed garden work.</w:t>
+      </w:r>
+    </w:p>
+    <w:p>
+      <w:pPr>
+        <w:pStyle w:val="ListParagraph"/>
+        <w:numPr>
+          <w:ilvl w:val="0"/>
+          <w:numId w:val="3"/>
+        </w:numPr>
+        <w:suppressAutoHyphens/>
+        <w:spacing w:after="80" w:line="360" w:lineRule="exact"/>
+        <w:rPr>
+          <w:rFonts w:ascii="Calibri" w:hAnsi="Calibri" w:cs="Calibri"/>
+        </w:rPr>
+      </w:pPr>
+      <w:r>
+        <w:rPr>
+          <w:rFonts w:ascii="Calibri" w:hAnsi="Calibri" w:cs="Calibri"/>
+          <w:color w:val="222222"/>
+        </w:rPr>
+        <w:t>Contact Us — phone, email, LinkedIn, operating hours and an embedded map.</w:t>
+      </w:r>
+    </w:p>
+    <w:p>
+      <w:pPr>
+        <w:pStyle w:val="ListParagraph"/>
+        <w:numPr>
+          <w:ilvl w:val="0"/>
+          <w:numId w:val="3"/>
+        </w:numPr>
+        <w:suppressAutoHyphens/>
+        <w:spacing w:after="80" w:line="360" w:lineRule="exact"/>
+        <w:rPr>
+          <w:rFonts w:ascii="Calibri" w:hAnsi="Calibri" w:cs="Calibri"/>
+        </w:rPr>
+      </w:pPr>
+      <w:r>
+        <w:rPr>
+          <w:rFonts w:ascii="Calibri" w:hAnsi="Calibri" w:cs="Calibri"/>
+          <w:color w:val="222222"/>
+        </w:rPr>
+        <w:t>Enquiry — a quote-request form (name, contact details, service needed, preferred date, message).</w:t>
+      </w:r>
+    </w:p>
+    <w:p>
+      <w:pPr>
+        <w:pStyle w:val="Heading1"/>
+      </w:pPr>
+      <w:r>
+        <w:t>Design and User Experience</w:t>
+      </w:r>
+    </w:p>
+    <w:p>
+      <w:pPr>
+        <w:pStyle w:val="Heading2"/>
+      </w:pPr>
+      <w:r>
+        <w:t>Colour Scheme</w:t>
+      </w:r>
+    </w:p>
+    <w:p>
+      <w:pPr>
+        <w:spacing w:after="160" w:line="360" w:lineRule="exact"/>
+        <w:rPr>
+          <w:rFonts w:ascii="Calibri" w:hAnsi="Calibri" w:cs="Calibri"/>
+        </w:rPr>
+      </w:pPr>
+      <w:r>
+        <w:rPr>
+          <w:rFonts w:ascii="Calibri" w:hAnsi="Calibri" w:cs="Calibri"/>
+          <w:color w:val="222222"/>
+        </w:rPr>
+        <w:t>Deep forest green and warm parchment as the base palette, with an ember-red-to-gold “flame lily” gradient used as a signature accent — a direct reference to the Gloriosa flower the business is named after.</w:t>
+      </w:r>
+    </w:p>
+    <w:p>
+      <w:pPr>
+        <w:pStyle w:val="Heading2"/>
+      </w:pPr>
+      <w:r>
+        <w:t>Typography</w:t>
+      </w:r>
+    </w:p>
+    <w:p>
+      <w:pPr>
+        <w:spacing w:after="160" w:line="360" w:lineRule="exact"/>
+        <w:rPr>
+          <w:rFonts w:ascii="Calibri" w:hAnsi="Calibri" w:cs="Calibri"/>
+        </w:rPr>
+      </w:pPr>
+      <w:r>
+        <w:rPr>
+          <w:rFonts w:ascii="Calibri" w:hAnsi="Calibri" w:cs="Calibri"/>
+          <w:color w:val="222222"/>
+        </w:rPr>
+        <w:t>Cormorant Garamond for headings (an elegant, botanical feel) paired with Mulish for body text (clean and highly readable at small sizes).</w:t>
+      </w:r>
+    </w:p>
+    <w:p>
+      <w:pPr>
+        <w:pStyle w:val="Heading2"/>
+      </w:pPr>
+      <w:r>
+        <w:t>Layout and Design Approach</w:t>
+      </w:r>
+    </w:p>
+    <w:p>
+      <w:pPr>
+        <w:spacing w:after="160" w:line="360" w:lineRule="exact"/>
+        <w:rPr>
+          <w:rFonts w:ascii="Calibri" w:hAnsi="Calibri" w:cs="Calibri"/>
+        </w:rPr>
+      </w:pPr>
+      <w:r>
+        <w:rPr>
+          <w:rFonts w:ascii="Calibri" w:hAnsi="Calibri" w:cs="Calibri"/>
+          <w:color w:val="222222"/>
+        </w:rPr>
+        <w:t>A card-based layout with a consistent header and navigation bar on every page, hero banners to introduce each section, and clear calls to action guiding visitors toward the Enquiry page.</w:t>
+      </w:r>
+    </w:p>
+    <w:p>
+      <w:pPr>
+        <w:pStyle w:val="Heading2"/>
+      </w:pPr>
+      <w:r>
+        <w:lastRenderedPageBreak/>
+        <w:t>User Experience Considerations</w:t>
+      </w:r>
+    </w:p>
+    <w:p>
+      <w:pPr>
+        <w:pStyle w:val="ListParagraph"/>
+        <w:numPr>
+          <w:ilvl w:val="0"/>
+          <w:numId w:val="3"/>
+        </w:numPr>
+        <w:suppressAutoHyphens/>
+        <w:spacing w:after="80" w:line="360" w:lineRule="exact"/>
+        <w:rPr>
+          <w:rFonts w:ascii="Calibri" w:hAnsi="Calibri" w:cs="Calibri"/>
+        </w:rPr>
+      </w:pPr>
+      <w:r>
+        <w:rPr>
+          <w:rFonts w:ascii="Calibri" w:hAnsi="Calibri" w:cs="Calibri"/>
+          <w:color w:val="222222"/>
+        </w:rPr>
+        <w:t>A single, consistent navigation bar with an active-page indicator across all six pages.</w:t>
+      </w:r>
+    </w:p>
+    <w:p>
+      <w:pPr>
+        <w:pStyle w:val="ListParagraph"/>
+        <w:numPr>
+          <w:ilvl w:val="0"/>
+          <w:numId w:val="3"/>
+        </w:numPr>
+        <w:suppressAutoHyphens/>
+        <w:spacing w:after="80" w:line="360" w:lineRule="exact"/>
+        <w:rPr>
+          <w:rFonts w:ascii="Calibri" w:hAnsi="Calibri" w:cs="Calibri"/>
+        </w:rPr>
+      </w:pPr>
+      <w:r>
+        <w:rPr>
+          <w:rFonts w:ascii="Calibri" w:hAnsi="Calibri" w:cs="Calibri"/>
+          <w:color w:val="222222"/>
+        </w:rPr>
+        <w:t>Mobile-responsive grids so the site is usable on phones and tablets, not just desktop.</w:t>
+      </w:r>
+    </w:p>
+    <w:p>
+      <w:pPr>
+        <w:pStyle w:val="ListParagraph"/>
+        <w:numPr>
+          <w:ilvl w:val="0"/>
+          <w:numId w:val="3"/>
+        </w:numPr>
+        <w:suppressAutoHyphens/>
+        <w:spacing w:after="80" w:line="360" w:lineRule="exact"/>
+        <w:rPr>
+          <w:rFonts w:ascii="Calibri" w:hAnsi="Calibri" w:cs="Calibri"/>
+        </w:rPr>
+      </w:pPr>
+      <w:r>
+        <w:rPr>
+          <w:rFonts w:ascii="Calibri" w:hAnsi="Calibri" w:cs="Calibri"/>
+          <w:color w:val="222222"/>
+        </w:rPr>
+        <w:t>A low-friction enquiry form as the primary conversion path.</w:t>
+      </w:r>
+    </w:p>
+    <w:p>
+      <w:pPr>
+        <w:pStyle w:val="Heading2"/>
+        <w:rPr>
+          <w:color w:val="2E74B5"/>
+        </w:rPr>
+      </w:pPr>
+      <w:r>
+        <w:t xml:space="preserve">Low-Fidelity Wireframe </w:t>
+      </w:r>
+    </w:p>
+    <w:p>
+      <w:pPr>
+        <w:spacing w:after="160" w:line="360" w:lineRule="exact"/>
+        <w:rPr>
+          <w:rFonts w:ascii="Calibri" w:hAnsi="Calibri" w:cs="Calibri"/>
+        </w:rPr>
+      </w:pPr>
+      <w:r>
+        <w:rPr>
+          <w:rFonts w:ascii="Calibri" w:hAnsi="Calibri" w:cs="Calibri"/>
+          <w:color w:val="222222"/>
+        </w:rPr>
+        <w:t>The wireframe below shows the intended layout and information hierarchy for the homepage: a header with logo and navigation, a hero banner, a row of feature highlights, a gallery preview, a call-to-action banner, and a footer.</w:t>
+      </w:r>
+    </w:p>
+    <w:p>
+      <w:pPr>
+        <w:pStyle w:val="Heading2"/>
+        <w:spacing w:before="200" w:after="120"/>
+        <w:rPr>
+          <w:rFonts w:ascii="Calibri" w:hAnsi="Calibri" w:cs="Calibri"/>
+          <w:sz w:val="22"/>
+          <w:szCs w:val="22"/>
+        </w:rPr>
+      </w:pPr>
+      <w:r>
+        <w:rPr>
+          <w:rFonts w:ascii="Calibri" w:hAnsi="Calibri" w:cs="Calibri"/>
+          <w:noProof/>
+          <w:sz w:val="22"/>
+          <w:szCs w:val="22"/>
+        </w:rPr>
+        <mc:AlternateContent>
+          <mc:Choice Requires="wps">
+            <w:drawing>
+              <wp:anchor distT="0" distB="0" distL="114300" distR="114300" simplePos="0" relativeHeight="251609600" behindDoc="0" locked="0" layoutInCell="1" allowOverlap="1" wp14:anchorId="3157B190" wp14:editId="45BBF658">
+                <wp:simplePos x="0" y="0"/>
+                <wp:positionH relativeFrom="margin">
+                  <wp:posOffset>-144780</wp:posOffset>
+                </wp:positionH>
+                <wp:positionV relativeFrom="paragraph">
+                  <wp:posOffset>139065</wp:posOffset>
+                </wp:positionV>
+                <wp:extent cx="3817620" cy="335280"/>
+                <wp:effectExtent l="0" t="0" r="11430" b="26670"/>
+                <wp:wrapNone/>
+                <wp:docPr id="48512925" name="Text Box 3"/>
+                <wp:cNvGraphicFramePr/>
+                <a:graphic xmlns:a="http://schemas.openxmlformats.org/drawingml/2006/main">
+                  <a:graphicData uri="http://schemas.microsoft.com/office/word/2010/wordprocessingShape">
+                    <wps:wsp>
+                      <wps:cNvSpPr txBox="1"/>
+                      <wps:spPr>
+                        <a:xfrm>
+                          <a:off x="0" y="0"/>
+                          <a:ext cx="3817620" cy="335280"/>
+                        </a:xfrm>
+                        <a:prstGeom prst="rect">
+                          <a:avLst/>
+                        </a:prstGeom>
+                        <a:solidFill>
+                          <a:schemeClr val="lt1"/>
+                        </a:solidFill>
+                        <a:ln w="6350">
+                          <a:solidFill>
+                            <a:prstClr val="black"/>
+                          </a:solidFill>
+                        </a:ln>
+                      </wps:spPr>
+                      <wps:txbx>
+                        <w:txbxContent>
+                          <w:p>
+                            <w:pPr>
+                              <w:jc w:val="center"/>
+                              <w:rPr>
+                                <w:lang w:val="en-US"/>
+                              </w:rPr>
+                            </w:pPr>
+                            <w:r>
+                              <w:rPr>
+                                <w:lang w:val="en-US"/>
+                              </w:rPr>
+                              <w:t>Logo</w:t>
+                            </w:r>
+                          </w:p>
+                        </w:txbxContent>
+                      </wps:txbx>
+                      <wps:bodyPr rot="0" spcFirstLastPara="0" vertOverflow="overflow" horzOverflow="overflow" vert="horz" wrap="square" lIns="91440" tIns="45720" rIns="91440" bIns="45720" numCol="1" spcCol="0" rtlCol="0" fromWordArt="0" anchor="ctr" anchorCtr="0" forceAA="0" compatLnSpc="1">
+                        <a:prstTxWarp prst="textNoShape">
+                          <a:avLst/>
+                        </a:prstTxWarp>
+                        <a:noAutofit/>
+                      </wps:bodyPr>
+                    </wps:wsp>
+                  </a:graphicData>
+                </a:graphic>
+                <wp14:sizeRelH relativeFrom="margin">
+                  <wp14:pctWidth>0</wp14:pctWidth>
+                </wp14:sizeRelH>
+              </wp:anchor>
+            </w:drawing>
+          </mc:Choice>
+          <mc:Fallback>
+            <w:pict>
+              <v:shapetype w14:anchorId="3157B190" id="_x0000_t202" coordsize="21600,21600" o:spt="202" path="m,l,21600r21600,l21600,xe">
+                <v:stroke joinstyle="miter"/>
+                <v:path gradientshapeok="t" o:connecttype="rect"/>
+              </v:shapetype>
+              <v:shape id="Text Box 3" o:spid="_x0000_s1026" type="#_x0000_t202" style="position:absolute;margin-left:-11.4pt;margin-top:10.95pt;width:300.6pt;height:26.4pt;z-index:251609600;visibility:visible;mso-wrap-style:square;mso-width-percent:0;mso-wrap-distance-left:9pt;mso-wrap-distance-top:0;mso-wrap-distance-right:9pt;mso-wrap-distance-bottom:0;mso-position-horizontal:absolute;mso-position-horizontal-relative:margin;mso-position-vertical:absolute;mso-position-vertical-relative:text;mso-width-percent:0;mso-width-relative:margin;v-text-anchor:middle" o:gfxdata="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" fillcolor="white [3201]" strokeweight=".5pt">
+                <v:textbox>
+                  <w:txbxContent>
+                    <w:p>
+                      <w:pPr>
+                        <w:jc w:val="center"/>
+                        <w:rPr>
+                          <w:lang w:val="en-US"/>
+                        </w:rPr>
+                      </w:pPr>
+                      <w:r>
+                        <w:rPr>
+                          <w:lang w:val="en-US"/>
+                        </w:rPr>
+                        <w:t>Logo</w:t>
+                      </w:r>
+                    </w:p>
+                  </w:txbxContent>
+                </v:textbox>
+                <w10:wrap anchorx="margin"/>
+              </v:shape>
+            </w:pict>
+          </mc:Fallback>
+        </mc:AlternateContent>
+      </w:r>
+      <w:r>
+        <w:rPr>
+          <w:rFonts w:ascii="Calibri" w:hAnsi="Calibri" w:cs="Calibri"/>
+          <w:noProof/>
+          <w:sz w:val="22"/>
+          <w:szCs w:val="22"/>
+        </w:rPr>
+        <mc:AlternateContent>
+          <mc:Choice Requires="wps">
+            <w:drawing>
+              <wp:anchor distT="45720" distB="45720" distL="114300" distR="114300" simplePos="0" relativeHeight="251604480" behindDoc="0" locked="0" layoutInCell="1" allowOverlap="1" wp14:anchorId="2942C6D7" wp14:editId="51B2A010">
+                <wp:simplePos x="0" y="0"/>
+                <wp:positionH relativeFrom="column">
+                  <wp:posOffset>-182880</wp:posOffset>
+                </wp:positionH>
+                <wp:positionV relativeFrom="paragraph">
+                  <wp:posOffset>40005</wp:posOffset>
+                </wp:positionV>
+                <wp:extent cx="3947160" cy="5166360"/>
+                <wp:effectExtent l="0" t="0" r="15240" b="15240"/>
+                <wp:wrapSquare wrapText="bothSides"/>
+                <wp:docPr id="217" name="Text Box 2"/>
+                <wp:cNvGraphicFramePr>
+                  <a:graphicFrameLocks xmlns:a="http://schemas.openxmlformats.org/drawingml/2006/main"/>
+                </wp:cNvGraphicFramePr>
+                <a:graphic xmlns:a="http://schemas.openxmlformats.org/drawingml/2006/main">
+                  <a:graphicData uri="http://schemas.microsoft.com/office/word/2010/wordprocessingShape">
+                    <wps:wsp>
+                      <wps:cNvSpPr txBox="1">
+                        <a:spLocks noChangeArrowheads="1"/>
+                      </wps:cNvSpPr>
+                      <wps:spPr bwMode="auto">
+                        <a:xfrm>
+                          <a:off x="0" y="0"/>
+                          <a:ext cx="3947160" cy="5166360"/>
+                        </a:xfrm>
+                        <a:prstGeom prst="rect">
+                          <a:avLst/>
+                        </a:prstGeom>
+                        <a:solidFill>
+                          <a:srgbClr val="FFFFFF"/>
+                        </a:solidFill>
+                        <a:ln w="9525">
+                          <a:solidFill>
+                            <a:srgbClr val="000000"/>
+                          </a:solidFill>
+                          <a:miter lim="800000"/>
+                          <a:headEnd/>
+                          <a:tailEnd/>
+                        </a:ln>
+                      </wps:spPr>
+                      <wps:txbx>
+                        <w:txbxContent>
+                          <w:p/>
+                        </w:txbxContent>
+                      </wps:txbx>
+                      <wps:bodyPr rot="0" vert="horz" wrap="square" lIns="91440" tIns="45720" rIns="91440" bIns="45720" anchor="t" anchorCtr="0">
+                        <a:noAutofit/>
+                      </wps:bodyPr>
+                    </wps:wsp>
+                  </a:graphicData>
+                </a:graphic>
+                <wp14:sizeRelH relativeFrom="margin">
+                  <wp14:pctWidth>0</wp14:pctWidth>
+                </wp14:sizeRelH>
+                <wp14:sizeRelV relativeFrom="margin">
+                  <wp14:pctHeight>0</wp14:pctHeight>
+                </wp14:sizeRelV>
+              </wp:anchor>
+            </w:drawing>
+          </mc:Choice>
+          <mc:Fallback>
+            <w:pict>
+              <v:shape w14:anchorId="2942C6D7" id="Text Box 2" o:spid="_x0000_s1027" type="#_x0000_t202" style="position:absolute;margin-left:-14.4pt;margin-top:3.15pt;width:310.8pt;height:406.8pt;z-index:251604480;visibility:visible;mso-wrap-style:square;mso-width-percent:0;mso-height-percent:0;mso-wrap-distance-left:9pt;mso-wrap-distance-top:3.6pt;mso-wrap-distance-right:9pt;mso-wrap-distance-bottom:3.6pt;mso-position-horizontal:absolute;mso-position-horizontal-relative:text;mso-position-vertical:absolute;mso-position-vertical-relative:text;mso-width-percent:0;mso-height-percent:0;mso-width-relative:margin;mso-height-relative:margin;v-text-anchor:top" o:gfxdata="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">
+                <v:textbox>
+                  <w:txbxContent>
+                    <w:p/>
+                  </w:txbxContent>
+                </v:textbox>
+                <w10:wrap type="square"/>
+              </v:shape>
+            </w:pict>
+          </mc:Fallback>
+        </mc:AlternateContent>
+      </w:r>
+    </w:p>
+    <w:p>
+      <w:pPr>
+        <w:pStyle w:val="Heading2"/>
+        <w:spacing w:before="200" w:after="120"/>
+        <w:rPr>
+          <w:rFonts w:ascii="Calibri" w:hAnsi="Calibri" w:cs="Calibri"/>
+          <w:sz w:val="22"/>
+          <w:szCs w:val="22"/>
+        </w:rPr>
+      </w:pPr>
+      <w:r>
+        <w:rPr>
+          <w:rFonts w:ascii="Calibri" w:hAnsi="Calibri" w:cs="Calibri"/>
+          <w:noProof/>
+          <w:sz w:val="22"/>
+          <w:szCs w:val="22"/>
+        </w:rPr>
+        <mc:AlternateContent>
+          <mc:Choice Requires="wps">
+            <w:drawing>
+              <wp:anchor distT="0" distB="0" distL="114300" distR="114300" simplePos="0" relativeHeight="251617792" behindDoc="0" locked="0" layoutInCell="1" allowOverlap="1" wp14:anchorId="75A95D61" wp14:editId="7693E07D">
+                <wp:simplePos x="0" y="0"/>
+                <wp:positionH relativeFrom="margin">
+                  <wp:posOffset>-114300</wp:posOffset>
+                </wp:positionH>
+                <wp:positionV relativeFrom="paragraph">
+                  <wp:posOffset>231775</wp:posOffset>
+                </wp:positionV>
+                <wp:extent cx="3817620" cy="335280"/>
+                <wp:effectExtent l="0" t="0" r="11430" b="26670"/>
+                <wp:wrapNone/>
+                <wp:docPr id="202159134" name="Text Box 3"/>
+                <wp:cNvGraphicFramePr/>
+                <a:graphic xmlns:a="http://schemas.openxmlformats.org/drawingml/2006/main">
+                  <a:graphicData uri="http://schemas.microsoft.com/office/word/2010/wordprocessingShape">
+                    <wps:wsp>
+                      <wps:cNvSpPr txBox="1"/>
+                      <wps:spPr>
+                        <a:xfrm>
+                          <a:off x="0" y="0"/>
+                          <a:ext cx="3817620" cy="335280"/>
+                        </a:xfrm>
+                        <a:prstGeom prst="rect">
+                          <a:avLst/>
+                        </a:prstGeom>
+                        <a:solidFill>
+                          <a:schemeClr val="lt1"/>
+                        </a:solidFill>
+                        <a:ln w="6350">
+                          <a:solidFill>
+                            <a:prstClr val="black"/>
+                          </a:solidFill>
+                        </a:ln>
+                      </wps:spPr>
+                      <wps:txbx>
+                        <w:txbxContent>
+                          <w:p>
+                            <w:pPr>
+                              <w:jc w:val="center"/>
+                              <w:rPr>
+                                <w:lang w:val="en-US"/>
+                              </w:rPr>
+                            </w:pPr>
+                            <w:r>
+                              <w:rPr>
+                                <w:lang w:val="en-US"/>
+                              </w:rPr>
+                              <w:t xml:space="preserve">Navigation </w:t>
+                            </w:r>
+                            <w:proofErr w:type="gramStart"/>
+                            <w:r>
+                              <w:rPr>
+                                <w:lang w:val="en-US"/>
+                              </w:rPr>
+                              <w:t>Menu(</w:t>
+                            </w:r>
+                            <w:proofErr w:type="gramEnd"/>
+                            <w:r>
+                              <w:rPr>
+                                <w:lang w:val="en-US"/>
+                              </w:rPr>
+                              <w:t>Hyperlinks)</w:t>
+                            </w:r>
+                          </w:p>
+                        </w:txbxContent>
+                      </wps:txbx>
+                      <wps:bodyPr rot="0" spcFirstLastPara="0" vertOverflow="overflow" horzOverflow="overflow" vert="horz" wrap="square" lIns="91440" tIns="45720" rIns="91440" bIns="45720" numCol="1" spcCol="0" rtlCol="0" fromWordArt="0" anchor="ctr" anchorCtr="0" forceAA="0" compatLnSpc="1">
+                        <a:prstTxWarp prst="textNoShape">
+                          <a:avLst/>
+                        </a:prstTxWarp>
+                        <a:noAutofit/>
+                      </wps:bodyPr>
+                    </wps:wsp>
+                  </a:graphicData>
+                </a:graphic>
+                <wp14:sizeRelH relativeFrom="margin">
+                  <wp14:pctWidth>0</wp14:pctWidth>
+                </wp14:sizeRelH>
+              </wp:anchor>
+            </w:drawing>
+          </mc:Choice>
+          <mc:Fallback>
+            <w:pict>
+              <v:shape w14:anchorId="75A95D61" id="_x0000_s1028" type="#_x0000_t202" style="position:absolute;margin-left:-9pt;margin-top:18.25pt;width:300.6pt;height:26.4pt;z-index:251617792;visibility:visible;mso-wrap-style:square;mso-width-percent:0;mso-wrap-distance-left:9pt;mso-wrap-distance-top:0;mso-wrap-distance-right:9pt;mso-wrap-distance-bottom:0;mso-position-horizontal:absolute;mso-position-horizontal-relative:margin;mso-position-vertical:absolute;mso-position-vertical-relative:text;mso-width-percent:0;mso-width-relative:margin;v-text-anchor:middle" o:gfxdata="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" fillcolor="white [3201]" strokeweight=".5pt">
+                <v:textbox>
+                  <w:txbxContent>
+                    <w:p>
+                      <w:pPr>
+                        <w:jc w:val="center"/>
+                        <w:rPr>
+                          <w:lang w:val="en-US"/>
+                        </w:rPr>
+                      </w:pPr>
+                      <w:r>
+                        <w:rPr>
+                          <w:lang w:val="en-US"/>
+                        </w:rPr>
+                        <w:t xml:space="preserve">Navigation </w:t>
+                      </w:r>
+                      <w:proofErr w:type="gramStart"/>
+                      <w:r>
+                        <w:rPr>
+                          <w:lang w:val="en-US"/>
+                        </w:rPr>
+                        <w:t>Menu(</w:t>
+                      </w:r>
+                      <w:proofErr w:type="gramEnd"/>
+                      <w:r>
+                        <w:rPr>
+                          <w:lang w:val="en-US"/>
+                        </w:rPr>
+                        <w:t>Hyperlinks)</w:t>
+                      </w:r>
+                    </w:p>
+                  </w:txbxContent>
+                </v:textbox>
+                <w10:wrap anchorx="margin"/>
+              </v:shape>
+            </w:pict>
+          </mc:Fallback>
+        </mc:AlternateContent>
+      </w:r>
+    </w:p>
+    <w:p>
+      <w:pPr>
+        <w:pStyle w:val="Heading2"/>
+        <w:spacing w:before="200" w:after="120"/>
+        <w:rPr>
+          <w:rFonts w:ascii="Calibri" w:hAnsi="Calibri" w:cs="Calibri"/>
+          <w:sz w:val="22"/>
+          <w:szCs w:val="22"/>
+        </w:rPr>
+      </w:pPr>
+      <w:r>
+        <w:rPr>
+          <w:rFonts w:ascii="Calibri" w:hAnsi="Calibri" w:cs="Calibri"/>
+          <w:noProof/>
+          <w:sz w:val="22"/>
+          <w:szCs w:val="22"/>
+        </w:rPr>
+        <mc:AlternateContent>
+          <mc:Choice Requires="wps">
+            <w:drawing>
+              <wp:anchor distT="0" distB="0" distL="114300" distR="114300" simplePos="0" relativeHeight="251629056" behindDoc="0" locked="0" layoutInCell="1" allowOverlap="1" wp14:anchorId="467701ED" wp14:editId="7155897C">
+                <wp:simplePos x="0" y="0"/>
+                <wp:positionH relativeFrom="margin">
+                  <wp:posOffset>-129540</wp:posOffset>
+                </wp:positionH>
+                <wp:positionV relativeFrom="paragraph">
+                  <wp:posOffset>299720</wp:posOffset>
+                </wp:positionV>
+                <wp:extent cx="3878580" cy="335280"/>
+                <wp:effectExtent l="0" t="0" r="26670" b="26670"/>
+                <wp:wrapNone/>
+                <wp:docPr id="1744396591" name="Text Box 3"/>
+                <wp:cNvGraphicFramePr/>
+                <a:graphic xmlns:a="http://schemas.openxmlformats.org/drawingml/2006/main">
+                  <a:graphicData uri="http://schemas.microsoft.com/office/word/2010/wordprocessingShape">
+                    <wps:wsp>
+                      <wps:cNvSpPr txBox="1"/>
+                      <wps:spPr>
+                        <a:xfrm>
+                          <a:off x="0" y="0"/>
+                          <a:ext cx="3878580" cy="335280"/>
+                        </a:xfrm>
+                        <a:prstGeom prst="rect">
+                          <a:avLst/>
+                        </a:prstGeom>
+                        <a:solidFill>
+                          <a:schemeClr val="lt1"/>
+                        </a:solidFill>
+                        <a:ln w="6350">
+                          <a:solidFill>
+                            <a:prstClr val="black"/>
+                          </a:solidFill>
+                        </a:ln>
+                      </wps:spPr>
+                      <wps:txbx>
+                        <w:txbxContent>
+                          <w:p>
+                            <w:pPr>
+                              <w:jc w:val="center"/>
+                              <w:rPr>
+                                <w:lang w:val="en-US"/>
+                              </w:rPr>
+                            </w:pPr>
+                            <w:r>
+                              <w:rPr>
+                                <w:lang w:val="en-US"/>
+                              </w:rPr>
+                              <w:t>Headline and about</w:t>
+                            </w:r>
+                          </w:p>
+                        </w:txbxContent>
+                      </wps:txbx>
+                      <wps:bodyPr rot="0" spcFirstLastPara="0" vertOverflow="overflow" horzOverflow="overflow" vert="horz" wrap="square" lIns="91440" tIns="45720" rIns="91440" bIns="45720" numCol="1" spcCol="0" rtlCol="0" fromWordArt="0" anchor="ctr" anchorCtr="0" forceAA="0" compatLnSpc="1">
+                        <a:prstTxWarp prst="textNoShape">
+                          <a:avLst/>
+                        </a:prstTxWarp>
+                        <a:noAutofit/>
+                      </wps:bodyPr>
+                    </wps:wsp>
+                  </a:graphicData>
+                </a:graphic>
+                <wp14:sizeRelH relativeFrom="margin">
+                  <wp14:pctWidth>0</wp14:pctWidth>
+                </wp14:sizeRelH>
+              </wp:anchor>
+            </w:drawing>
+          </mc:Choice>
+          <mc:Fallback>
+            <w:pict>
+              <v:shape w14:anchorId="467701ED" id="_x0000_s1029" type="#_x0000_t202" style="position:absolute;margin-left:-10.2pt;margin-top:23.6pt;width:305.4pt;height:26.4pt;z-index:251629056;visibility:visible;mso-wrap-style:square;mso-width-percent:0;mso-wrap-distance-left:9pt;mso-wrap-distance-top:0;mso-wrap-distance-right:9pt;mso-wrap-distance-bottom:0;mso-position-horizontal:absolute;mso-position-horizontal-relative:margin;mso-position-vertical:absolute;mso-position-vertical-relative:text;mso-width-percent:0;mso-width-relative:margin;v-text-anchor:middle" o:gfxdata="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" fillcolor="white [3201]" strokeweight=".5pt">
+                <v:textbox>
+                  <w:txbxContent>
+                    <w:p>
+                      <w:pPr>
+                        <w:jc w:val="center"/>
+                        <w:rPr>
+                          <w:lang w:val="en-US"/>
+                        </w:rPr>
+                      </w:pPr>
+                      <w:r>
+                        <w:rPr>
+                          <w:lang w:val="en-US"/>
+                        </w:rPr>
+                        <w:t>Headline and about</w:t>
+                      </w:r>
+                    </w:p>
+                  </w:txbxContent>
+                </v:textbox>
+                <w10:wrap anchorx="margin"/>
+              </v:shape>
+            </w:pict>
+          </mc:Fallback>
+        </mc:AlternateContent>
+      </w:r>
+    </w:p>
+    <w:p>
+      <w:pPr>
+        <w:pStyle w:val="Heading2"/>
+        <w:spacing w:before="200" w:after="120"/>
+        <w:rPr>
+          <w:rFonts w:ascii="Calibri" w:hAnsi="Calibri" w:cs="Calibri"/>
+          <w:sz w:val="22"/>
+          <w:szCs w:val="22"/>
+        </w:rPr>
+      </w:pPr>
+    </w:p>
+    <w:p>
+      <w:pPr>
+        <w:pStyle w:val="Heading2"/>
+        <w:spacing w:before="200" w:after="120"/>
+        <w:rPr>
+          <w:rFonts w:ascii="Calibri" w:hAnsi="Calibri" w:cs="Calibri"/>
+          <w:sz w:val="22"/>
+          <w:szCs w:val="22"/>
+        </w:rPr>
+      </w:pPr>
+      <w:r>
+        <w:rPr>
+          <w:rFonts w:ascii="Calibri" w:hAnsi="Calibri" w:cs="Calibri"/>
+          <w:noProof/>
+          <w:sz w:val="22"/>
+          <w:szCs w:val="22"/>
+        </w:rPr>
+        <mc:AlternateContent>
+          <mc:Choice Requires="wps">
+            <w:drawing>
+              <wp:anchor distT="0" distB="0" distL="114300" distR="114300" simplePos="0" relativeHeight="251694592" behindDoc="0" locked="0" layoutInCell="1" allowOverlap="1" wp14:anchorId="06CAEC89" wp14:editId="77294319">
+                <wp:simplePos x="0" y="0"/>
+                <wp:positionH relativeFrom="margin">
+                  <wp:posOffset>2446020</wp:posOffset>
+                </wp:positionH>
+                <wp:positionV relativeFrom="paragraph">
+                  <wp:posOffset>61595</wp:posOffset>
+                </wp:positionV>
+                <wp:extent cx="1272540" cy="1158240"/>
+                <wp:effectExtent l="0" t="0" r="22860" b="22860"/>
+                <wp:wrapNone/>
+                <wp:docPr id="1467102876" name="Text Box 3"/>
+                <wp:cNvGraphicFramePr/>
+                <a:graphic xmlns:a="http://schemas.openxmlformats.org/drawingml/2006/main">
+                  <a:graphicData uri="http://schemas.microsoft.com/office/word/2010/wordprocessingShape">
+                    <wps:wsp>
+                      <wps:cNvSpPr txBox="1"/>
+                      <wps:spPr>
+                        <a:xfrm>
+                          <a:off x="0" y="0"/>
+                          <a:ext cx="1272540" cy="1158240"/>
+                        </a:xfrm>
+                        <a:prstGeom prst="rect">
+                          <a:avLst/>
+                        </a:prstGeom>
+                        <a:solidFill>
+                          <a:schemeClr val="lt1"/>
+                        </a:solidFill>
+                        <a:ln w="6350">
+                          <a:solidFill>
+                            <a:prstClr val="black"/>
+                          </a:solidFill>
+                        </a:ln>
+                      </wps:spPr>
+                      <wps:txbx>
+                        <w:txbxContent>
+                          <w:p>
+                            <w:pPr>
+                              <w:jc w:val="center"/>
+                              <w:rPr>
+                                <w:lang w:val="en-US"/>
+                              </w:rPr>
+                            </w:pPr>
+                            <w:r>
+                              <w:rPr>
+                                <w:lang w:val="en-US"/>
+                              </w:rPr>
+                              <w:t>Services</w:t>
+                            </w:r>
+                          </w:p>
+                        </w:txbxContent>
+                      </wps:txbx>
+                      <wps:bodyPr rot="0" spcFirstLastPara="0" vertOverflow="overflow" horzOverflow="overflow" vert="horz" wrap="square" lIns="91440" tIns="45720" rIns="91440" bIns="45720" numCol="1" spcCol="0" rtlCol="0" fromWordArt="0" anchor="ctr" anchorCtr="0" forceAA="0" compatLnSpc="1">
+                        <a:prstTxWarp prst="textNoShape">
+                          <a:avLst/>
+                        </a:prstTxWarp>
+                        <a:noAutofit/>
+                      </wps:bodyPr>
+                    </wps:wsp>
+                  </a:graphicData>
+                </a:graphic>
+                <wp14:sizeRelH relativeFrom="margin">
+                  <wp14:pctWidth>0</wp14:pctWidth>
+                </wp14:sizeRelH>
+                <wp14:sizeRelV relativeFrom="margin">
+                  <wp14:pctHeight>0</wp14:pctHeight>
+                </wp14:sizeRelV>
+              </wp:anchor>
+            </w:drawing>
+          </mc:Choice>
+          <mc:Fallback>
+            <w:pict>
+              <v:shape w14:anchorId="06CAEC89" id="_x0000_s1030" type="#_x0000_t202" style="position:absolute;margin-left:192.6pt;margin-top:4.85pt;width:100.2pt;height:91.2pt;z-index:251694592;visibility:visible;mso-wrap-style:square;mso-width-percent:0;mso-height-percent:0;mso-wrap-distance-left:9pt;mso-wrap-distance-top:0;mso-wrap-distance-right:9pt;mso-wrap-distance-bottom:0;mso-position-horizontal:absolute;mso-position-horizontal-relative:margin;mso-position-vertical:absolute;mso-position-vertical-relative:text;mso-width-percent:0;mso-height-percent:0;mso-width-relative:margin;mso-height-relative:margin;v-text-anchor:middle" o:gfxdata="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" fillcolor="white [3201]" strokeweight=".5pt">
+                <v:textbox>
+                  <w:txbxContent>
+                    <w:p>
+                      <w:pPr>
+                        <w:jc w:val="center"/>
+                        <w:rPr>
+                          <w:lang w:val="en-US"/>
+                        </w:rPr>
+                      </w:pPr>
+                      <w:r>
+                        <w:rPr>
+                          <w:lang w:val="en-US"/>
+                        </w:rPr>
+                        <w:t>Services</w:t>
+                      </w:r>
+                    </w:p>
+                  </w:txbxContent>
+                </v:textbox>
+                <w10:wrap anchorx="margin"/>
+              </v:shape>
+            </w:pict>
+          </mc:Fallback>
+        </mc:AlternateContent>
+      </w:r>
+      <w:r>
+        <w:rPr>
+          <w:rFonts w:ascii="Calibri" w:hAnsi="Calibri" w:cs="Calibri"/>
+          <w:noProof/>
+          <w:sz w:val="22"/>
+          <w:szCs w:val="22"/>
+        </w:rPr>
+        <mc:AlternateContent>
+          <mc:Choice Requires="wps">
+            <w:drawing>
+              <wp:anchor distT="0" distB="0" distL="114300" distR="114300" simplePos="0" relativeHeight="251675136" behindDoc="0" locked="0" layoutInCell="1" allowOverlap="1" wp14:anchorId="708A5D69" wp14:editId="624BABFB">
+                <wp:simplePos x="0" y="0"/>
+                <wp:positionH relativeFrom="margin">
+                  <wp:posOffset>1150620</wp:posOffset>
+                </wp:positionH>
+                <wp:positionV relativeFrom="paragraph">
+                  <wp:posOffset>61595</wp:posOffset>
+                </wp:positionV>
+                <wp:extent cx="1272540" cy="1188720"/>
+                <wp:effectExtent l="0" t="0" r="22860" b="11430"/>
+                <wp:wrapNone/>
+                <wp:docPr id="1474572395" name="Text Box 3"/>
+                <wp:cNvGraphicFramePr/>
+                <a:graphic xmlns:a="http://schemas.openxmlformats.org/drawingml/2006/main">
+                  <a:graphicData uri="http://schemas.microsoft.com/office/word/2010/wordprocessingShape">
+                    <wps:wsp>
+                      <wps:cNvSpPr txBox="1"/>
+                      <wps:spPr>
+                        <a:xfrm>
+                          <a:off x="0" y="0"/>
+                          <a:ext cx="1272540" cy="1188720"/>
+                        </a:xfrm>
+                        <a:prstGeom prst="rect">
+                          <a:avLst/>
+                        </a:prstGeom>
+                        <a:solidFill>
+                          <a:schemeClr val="lt1"/>
+                        </a:solidFill>
+                        <a:ln w="6350">
+                          <a:solidFill>
+                            <a:prstClr val="black"/>
+                          </a:solidFill>
+                        </a:ln>
+                      </wps:spPr>
+                      <wps:txbx>
+                        <w:txbxContent>
+                          <w:p>
+                            <w:pPr>
+                              <w:jc w:val="center"/>
+                              <w:rPr>
+                                <w:lang w:val="en-US"/>
+                              </w:rPr>
+                            </w:pPr>
+                            <w:r>
+                              <w:rPr>
+                                <w:lang w:val="en-US"/>
+                              </w:rPr>
+                              <w:t>Services</w:t>
+                            </w:r>
+                          </w:p>
+                        </w:txbxContent>
+                      </wps:txbx>
+                      <wps:bodyPr rot="0" spcFirstLastPara="0" vertOverflow="overflow" horzOverflow="overflow" vert="horz" wrap="square" lIns="91440" tIns="45720" rIns="91440" bIns="45720" numCol="1" spcCol="0" rtlCol="0" fromWordArt="0" anchor="ctr" anchorCtr="0" forceAA="0" compatLnSpc="1">
+                        <a:prstTxWarp prst="textNoShape">
+                          <a:avLst/>
+                        </a:prstTxWarp>
+                        <a:noAutofit/>
+                      </wps:bodyPr>
+                    </wps:wsp>
+                  </a:graphicData>
+                </a:graphic>
+                <wp14:sizeRelH relativeFrom="margin">
+                  <wp14:pctWidth>0</wp14:pctWidth>
+                </wp14:sizeRelH>
+                <wp14:sizeRelV relativeFrom="margin">
+                  <wp14:pctHeight>0</wp14:pctHeight>
+                </wp14:sizeRelV>
+              </wp:anchor>
+            </w:drawing>
+          </mc:Choice>
+          <mc:Fallback>
+            <w:pict>
+              <v:shape w14:anchorId="708A5D69" id="_x0000_s1031" type="#_x0000_t202" style="position:absolute;margin-left:90.6pt;margin-top:4.85pt;width:100.2pt;height:93.6pt;z-index:251675136;visibility:visible;mso-wrap-style:square;mso-width-percent:0;mso-height-percent:0;mso-wrap-distance-left:9pt;mso-wrap-distance-top:0;mso-wrap-distance-right:9pt;mso-wrap-distance-bottom:0;mso-position-horizontal:absolute;mso-position-horizontal-relative:margin;mso-position-vertical:absolute;mso-position-vertical-relative:text;mso-width-percent:0;mso-height-percent:0;mso-width-relative:margin;mso-height-relative:margin;v-text-anchor:middle" o:gfxdata="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" fillcolor="white [3201]" strokeweight=".5pt">
+                <v:textbox>
+                  <w:txbxContent>
+                    <w:p>
+                      <w:pPr>
+                        <w:jc w:val="center"/>
+                        <w:rPr>
+                          <w:lang w:val="en-US"/>
+                        </w:rPr>
+                      </w:pPr>
+                      <w:r>
+                        <w:rPr>
+                          <w:lang w:val="en-US"/>
+                        </w:rPr>
+                        <w:t>Services</w:t>
+                      </w:r>
+                    </w:p>
+                  </w:txbxContent>
+                </v:textbox>
+                <w10:wrap anchorx="margin"/>
+              </v:shape>
+            </w:pict>
+          </mc:Fallback>
+        </mc:AlternateContent>
+      </w:r>
+      <w:r>
+        <w:rPr>
+          <w:rFonts w:ascii="Calibri" w:hAnsi="Calibri" w:cs="Calibri"/>
+          <w:noProof/>
+          <w:sz w:val="22"/>
+          <w:szCs w:val="22"/>
+        </w:rPr>
+        <mc:AlternateContent>
+          <mc:Choice Requires="wps">
+            <w:drawing>
+              <wp:anchor distT="0" distB="0" distL="114300" distR="114300" simplePos="0" relativeHeight="251650560" behindDoc="0" locked="0" layoutInCell="1" allowOverlap="1" wp14:anchorId="0C7E0422" wp14:editId="071B0971">
+                <wp:simplePos x="0" y="0"/>
+                <wp:positionH relativeFrom="margin">
+                  <wp:posOffset>-137160</wp:posOffset>
+                </wp:positionH>
+                <wp:positionV relativeFrom="paragraph">
+                  <wp:posOffset>61595</wp:posOffset>
+                </wp:positionV>
+                <wp:extent cx="1272540" cy="1203960"/>
+                <wp:effectExtent l="0" t="0" r="22860" b="15240"/>
+                <wp:wrapNone/>
+                <wp:docPr id="943172360" name="Text Box 3"/>
+                <wp:cNvGraphicFramePr/>
+                <a:graphic xmlns:a="http://schemas.openxmlformats.org/drawingml/2006/main">
+                  <a:graphicData uri="http://schemas.microsoft.com/office/word/2010/wordprocessingShape">
+                    <wps:wsp>
+                      <wps:cNvSpPr txBox="1"/>
+                      <wps:spPr>
+                        <a:xfrm>
+                          <a:off x="0" y="0"/>
+                          <a:ext cx="1272540" cy="1203960"/>
+                        </a:xfrm>
+                        <a:prstGeom prst="rect">
+                          <a:avLst/>
+                        </a:prstGeom>
+                        <a:solidFill>
+                          <a:schemeClr val="lt1"/>
+                        </a:solidFill>
+                        <a:ln w="6350">
+                          <a:solidFill>
+                            <a:prstClr val="black"/>
+                          </a:solidFill>
+                        </a:ln>
+                      </wps:spPr>
+                      <wps:txbx>
+                        <w:txbxContent>
+                          <w:p>
+                            <w:pPr>
+                              <w:jc w:val="center"/>
+                              <w:rPr>
+                                <w:lang w:val="en-US"/>
+                              </w:rPr>
+                            </w:pPr>
+                            <w:r>
+                              <w:rPr>
+                                <w:lang w:val="en-US"/>
+                              </w:rPr>
+                              <w:t>Services</w:t>
+                            </w:r>
+                          </w:p>
+                        </w:txbxContent>
+                      </wps:txbx>
+                      <wps:bodyPr rot="0" spcFirstLastPara="0" vertOverflow="overflow" horzOverflow="overflow" vert="horz" wrap="square" lIns="91440" tIns="45720" rIns="91440" bIns="45720" numCol="1" spcCol="0" rtlCol="0" fromWordArt="0" anchor="ctr" anchorCtr="0" forceAA="0" compatLnSpc="1">
+                        <a:prstTxWarp prst="textNoShape">
+                          <a:avLst/>
+                        </a:prstTxWarp>
+                        <a:noAutofit/>
+                      </wps:bodyPr>
+                    </wps:wsp>
+                  </a:graphicData>
+                </a:graphic>
+                <wp14:sizeRelH relativeFrom="margin">
+                  <wp14:pctWidth>0</wp14:pctWidth>
+                </wp14:sizeRelH>
+                <wp14:sizeRelV relativeFrom="margin">
+                  <wp14:pctHeight>0</wp14:pctHeight>
+                </wp14:sizeRelV>
+              </wp:anchor>
+            </w:drawing>
+          </mc:Choice>
+          <mc:Fallback>
+            <w:pict>
+              <v:shape w14:anchorId="0C7E0422" id="_x0000_s1032" type="#_x0000_t202" style="position:absolute;margin-left:-10.8pt;margin-top:4.85pt;width:100.2pt;height:94.8pt;z-index:251650560;visibility:visible;mso-wrap-style:square;mso-width-percent:0;mso-height-percent:0;mso-wrap-distance-left:9pt;mso-wrap-distance-top:0;mso-wrap-distance-right:9pt;mso-wrap-distance-bottom:0;mso-position-horizontal:absolute;mso-position-horizontal-relative:margin;mso-position-vertical:absolute;mso-position-vertical-relative:text;mso-width-percent:0;mso-height-percent:0;mso-width-relative:margin;mso-height-relative:margin;v-text-anchor:middle" o:gfxdata="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" fillcolor="white [3201]" strokeweight=".5pt">
+                <v:textbox>
+                  <w:txbxContent>
+                    <w:p>
+                      <w:pPr>
+                        <w:jc w:val="center"/>
+                        <w:rPr>
+                          <w:lang w:val="en-US"/>
+                        </w:rPr>
+                      </w:pPr>
+                      <w:r>
+                        <w:rPr>
+                          <w:lang w:val="en-US"/>
+                        </w:rPr>
+                        <w:t>Services</w:t>
+                      </w:r>
+                    </w:p>
+                  </w:txbxContent>
+                </v:textbox>
+                <w10:wrap anchorx="margin"/>
+              </v:shape>
+            </w:pict>
+          </mc:Fallback>
+        </mc:AlternateContent>
+      </w:r>
+    </w:p>
+    <w:p>
+      <w:pPr>
+        <w:pStyle w:val="Heading2"/>
+        <w:spacing w:before="200" w:after="120"/>
+        <w:rPr>
+          <w:rFonts w:ascii="Calibri" w:hAnsi="Calibri" w:cs="Calibri"/>
+          <w:sz w:val="22"/>
+          <w:szCs w:val="22"/>
+        </w:rPr>
+      </w:pPr>
+    </w:p>
+    <w:p>
+      <w:pPr>
+        <w:pStyle w:val="Heading2"/>
+        <w:spacing w:before="200" w:after="120"/>
+        <w:rPr>
+          <w:rFonts w:ascii="Calibri" w:hAnsi="Calibri" w:cs="Calibri"/>
+          <w:sz w:val="22"/>
+          <w:szCs w:val="22"/>
+        </w:rPr>
+      </w:pPr>
+    </w:p>
+    <w:p>
+      <w:pPr>
+        <w:pStyle w:val="Heading2"/>
+        <w:spacing w:before="200" w:after="120"/>
+        <w:rPr>
+          <w:rFonts w:ascii="Calibri" w:hAnsi="Calibri" w:cs="Calibri"/>
+          <w:sz w:val="22"/>
+          <w:szCs w:val="22"/>
+        </w:rPr>
+      </w:pPr>
+    </w:p>
+    <w:p>
+      <w:pPr>
+        <w:pStyle w:val="Heading2"/>
+        <w:spacing w:before="200" w:after="120"/>
+        <w:rPr>
+          <w:rFonts w:ascii="Calibri" w:hAnsi="Calibri" w:cs="Calibri"/>
+          <w:sz w:val="22"/>
+          <w:szCs w:val="22"/>
+        </w:rPr>
+      </w:pPr>
+      <w:r>
+        <w:rPr>
+          <w:rFonts w:ascii="Calibri" w:hAnsi="Calibri" w:cs="Calibri"/>
+          <w:noProof/>
+          <w:sz w:val="22"/>
+          <w:szCs w:val="22"/>
+        </w:rPr>
+        <mc:AlternateContent>
+          <mc:Choice Requires="wps">
+            <w:drawing>
+              <wp:anchor distT="0" distB="0" distL="114300" distR="114300" simplePos="0" relativeHeight="251702784" behindDoc="0" locked="0" layoutInCell="1" allowOverlap="1" wp14:anchorId="5CA3658B" wp14:editId="7EB74212">
+                <wp:simplePos x="0" y="0"/>
+                <wp:positionH relativeFrom="margin">
+                  <wp:posOffset>-121920</wp:posOffset>
+                </wp:positionH>
+                <wp:positionV relativeFrom="paragraph">
+                  <wp:posOffset>58420</wp:posOffset>
+                </wp:positionV>
+                <wp:extent cx="3787140" cy="1676400"/>
+                <wp:effectExtent l="0" t="0" r="22860" b="19050"/>
+                <wp:wrapNone/>
+                <wp:docPr id="2115364236" name="Text Box 3"/>
+                <wp:cNvGraphicFramePr/>
+                <a:graphic xmlns:a="http://schemas.openxmlformats.org/drawingml/2006/main">
+                  <a:graphicData uri="http://schemas.microsoft.com/office/word/2010/wordprocessingShape">
+                    <wps:wsp>
+                      <wps:cNvSpPr txBox="1"/>
+                      <wps:spPr>
+                        <a:xfrm>
+                          <a:off x="0" y="0"/>
+                          <a:ext cx="3787140" cy="1676400"/>
+                        </a:xfrm>
+                        <a:prstGeom prst="rect">
+                          <a:avLst/>
+                        </a:prstGeom>
+                        <a:solidFill>
+                          <a:schemeClr val="lt1"/>
+                        </a:solidFill>
+                        <a:ln w="6350">
+                          <a:solidFill>
+                            <a:prstClr val="black"/>
+                          </a:solidFill>
+                        </a:ln>
+                      </wps:spPr>
+                      <wps:txbx>
+                        <w:txbxContent>
+                          <w:p>
+                            <w:pPr>
+                              <w:jc w:val="center"/>
+                              <w:rPr>
+                                <w:lang w:val="en-US"/>
+                              </w:rPr>
+                            </w:pPr>
+                            <w:r>
+                              <w:rPr>
+                                <w:lang w:val="en-US"/>
+                              </w:rPr>
+                              <w:t>Information</w:t>
+                            </w:r>
+                          </w:p>
+                        </w:txbxContent>
+                      </wps:txbx>
+                      <wps:bodyPr rot="0" spcFirstLastPara="0" vertOverflow="overflow" horzOverflow="overflow" vert="horz" wrap="square" lIns="91440" tIns="45720" rIns="91440" bIns="45720" numCol="1" spcCol="0" rtlCol="0" fromWordArt="0" anchor="ctr" anchorCtr="0" forceAA="0" compatLnSpc="1">
+                        <a:prstTxWarp prst="textNoShape">
+                          <a:avLst/>
+                        </a:prstTxWarp>
+                        <a:noAutofit/>
+                      </wps:bodyPr>
+                    </wps:wsp>
+                  </a:graphicData>
+                </a:graphic>
+                <wp14:sizeRelH relativeFrom="margin">
+                  <wp14:pctWidth>0</wp14:pctWidth>
+                </wp14:sizeRelH>
+                <wp14:sizeRelV relativeFrom="margin">
+                  <wp14:pctHeight>0</wp14:pctHeight>
+                </wp14:sizeRelV>
+              </wp:anchor>
+            </w:drawing>
+          </mc:Choice>
+          <mc:Fallback>
+            <w:pict>
+              <v:shape w14:anchorId="5CA3658B" id="_x0000_s1033" type="#_x0000_t202" style="position:absolute;margin-left:-9.6pt;margin-top:4.6pt;width:298.2pt;height:132pt;z-index:251702784;visibility:visible;mso-wrap-style:square;mso-width-percent:0;mso-height-percent:0;mso-wrap-distance-left:9pt;mso-wrap-distance-top:0;mso-wrap-distance-right:9pt;mso-wrap-distance-bottom:0;mso-position-horizontal:absolute;mso-position-horizontal-relative:margin;mso-position-vertical:absolute;mso-position-vertical-relative:text;mso-width-percent:0;mso-height-percent:0;mso-width-relative:margin;mso-height-relative:margin;v-text-anchor:middle" o:gfxdata="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" fillcolor="white [3201]" strokeweight=".5pt">
+                <v:textbox>
+                  <w:txbxContent>
+                    <w:p>
+                      <w:pPr>
+                        <w:jc w:val="center"/>
+                        <w:rPr>
+                          <w:lang w:val="en-US"/>
+                        </w:rPr>
+                      </w:pPr>
+                      <w:r>
+                        <w:rPr>
+                          <w:lang w:val="en-US"/>
+                        </w:rPr>
+                        <w:t>Information</w:t>
+                      </w:r>
+                    </w:p>
+                  </w:txbxContent>
+                </v:textbox>
+                <w10:wrap anchorx="margin"/>
+              </v:shape>
+            </w:pict>
+          </mc:Fallback>
+        </mc:AlternateContent>
+      </w:r>
+    </w:p>
+    <w:p>
+      <w:pPr>
+        <w:pStyle w:val="Heading2"/>
+        <w:spacing w:before="200" w:after="120"/>
+        <w:rPr>
+          <w:rFonts w:ascii="Calibri" w:hAnsi="Calibri" w:cs="Calibri"/>
+          <w:sz w:val="22"/>
+          <w:szCs w:val="22"/>
+        </w:rPr>
+      </w:pPr>
+    </w:p>
+    <w:p>
+      <w:pPr>
+        <w:pStyle w:val="Heading2"/>
+        <w:spacing w:before="200" w:after="120"/>
+        <w:rPr>
+          <w:rFonts w:ascii="Calibri" w:hAnsi="Calibri" w:cs="Calibri"/>
+          <w:sz w:val="22"/>
+          <w:szCs w:val="22"/>
+        </w:rPr>
+      </w:pPr>
+    </w:p>
+    <w:p>
+      <w:pPr>
+        <w:pStyle w:val="Heading2"/>
+        <w:spacing w:before="200" w:after="120"/>
+        <w:rPr>
+          <w:rFonts w:ascii="Calibri" w:hAnsi="Calibri" w:cs="Calibri"/>
+          <w:sz w:val="22"/>
+          <w:szCs w:val="22"/>
+        </w:rPr>
+      </w:pPr>
+    </w:p>
+    <w:p>
+      <w:pPr>
+        <w:pStyle w:val="Heading2"/>
+        <w:spacing w:before="200" w:after="120"/>
+        <w:rPr>
+          <w:rFonts w:ascii="Calibri" w:hAnsi="Calibri" w:cs="Calibri"/>
+          <w:sz w:val="22"/>
+          <w:szCs w:val="22"/>
+        </w:rPr>
+      </w:pPr>
+    </w:p>
+    <w:p>
+      <w:pPr>
+        <w:pStyle w:val="Heading2"/>
+        <w:spacing w:before="200" w:after="120"/>
+        <w:rPr>
+          <w:rFonts w:ascii="Calibri" w:hAnsi="Calibri" w:cs="Calibri"/>
+          <w:sz w:val="22"/>
+          <w:szCs w:val="22"/>
+        </w:rPr>
+      </w:pPr>
+      <w:r>
+        <w:rPr>
+          <w:rFonts w:ascii="Calibri" w:hAnsi="Calibri" w:cs="Calibri"/>
+          <w:noProof/>
+          <w:sz w:val="22"/>
+          <w:szCs w:val="22"/>
+        </w:rPr>
+        <mc:AlternateContent>
+          <mc:Choice Requires="wps">
+            <w:drawing>
+              <wp:anchor distT="0" distB="0" distL="114300" distR="114300" simplePos="0" relativeHeight="251712000" behindDoc="0" locked="0" layoutInCell="1" allowOverlap="1" wp14:anchorId="29842CFD" wp14:editId="5F3BD7B5">
+                <wp:simplePos x="0" y="0"/>
+                <wp:positionH relativeFrom="margin">
+                  <wp:posOffset>-106680</wp:posOffset>
+                </wp:positionH>
+                <wp:positionV relativeFrom="paragraph">
+                  <wp:posOffset>145415</wp:posOffset>
+                </wp:positionV>
+                <wp:extent cx="3878580" cy="335280"/>
+                <wp:effectExtent l="0" t="0" r="26670" b="26670"/>
+                <wp:wrapNone/>
+                <wp:docPr id="434150687" name="Text Box 3"/>
+                <wp:cNvGraphicFramePr/>
+                <a:graphic xmlns:a="http://schemas.openxmlformats.org/drawingml/2006/main">
+                  <a:graphicData uri="http://schemas.microsoft.com/office/word/2010/wordprocessingShape">
+                    <wps:wsp>
+                      <wps:cNvSpPr txBox="1"/>
+                      <wps:spPr>
+                        <a:xfrm>
+                          <a:off x="0" y="0"/>
+                          <a:ext cx="3878580" cy="335280"/>
+                        </a:xfrm>
+                        <a:prstGeom prst="rect">
+                          <a:avLst/>
+                        </a:prstGeom>
+                        <a:solidFill>
+                          <a:schemeClr val="lt1"/>
+                        </a:solidFill>
+                        <a:ln w="6350">
+                          <a:solidFill>
+                            <a:prstClr val="black"/>
+                          </a:solidFill>
+                        </a:ln>
+                      </wps:spPr>
+                      <wps:txbx>
+                        <w:txbxContent>
+                          <w:p>
+                            <w:pPr>
+                              <w:jc w:val="center"/>
+                              <w:rPr>
+                                <w:lang w:val="en-US"/>
+                              </w:rPr>
+                            </w:pPr>
+                            <w:r>
+                              <w:rPr>
+                                <w:lang w:val="en-US"/>
+                              </w:rPr>
+                              <w:t>Enquiry</w:t>
+                            </w:r>
+                          </w:p>
+                        </w:txbxContent>
+                      </wps:txbx>
+                      <wps:bodyPr rot="0" spcFirstLastPara="0" vertOverflow="overflow" horzOverflow="overflow" vert="horz" wrap="square" lIns="91440" tIns="45720" rIns="91440" bIns="45720" numCol="1" spcCol="0" rtlCol="0" fromWordArt="0" anchor="ctr" anchorCtr="0" forceAA="0" compatLnSpc="1">
+                        <a:prstTxWarp prst="textNoShape">
+                          <a:avLst/>
+                        </a:prstTxWarp>
+                        <a:noAutofit/>
+                      </wps:bodyPr>
+                    </wps:wsp>
+                  </a:graphicData>
+                </a:graphic>
+                <wp14:sizeRelH relativeFrom="margin">
+                  <wp14:pctWidth>0</wp14:pctWidth>
+                </wp14:sizeRelH>
+              </wp:anchor>
+            </w:drawing>
+          </mc:Choice>
+          <mc:Fallback>
+            <w:pict>
+              <v:shape w14:anchorId="29842CFD" id="_x0000_s1034" type="#_x0000_t202" style="position:absolute;margin-left:-8.4pt;margin-top:11.45pt;width:305.4pt;height:26.4pt;z-index:251712000;visibility:visible;mso-wrap-style:square;mso-width-percent:0;mso-wrap-distance-left:9pt;mso-wrap-distance-top:0;mso-wrap-distance-right:9pt;mso-wrap-distance-bottom:0;mso-position-horizontal:absolute;mso-position-horizontal-relative:margin;mso-position-vertical:absolute;mso-position-vertical-relative:text;mso-width-percent:0;mso-width-relative:margin;v-text-anchor:middle" o:gfxdata="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" fillcolor="white [3201]" strokeweight=".5pt">
+                <v:textbox>
+                  <w:txbxContent>
+                    <w:p>
+                      <w:pPr>
+                        <w:jc w:val="center"/>
+                        <w:rPr>
+                          <w:lang w:val="en-US"/>
+                        </w:rPr>
+                      </w:pPr>
+                      <w:r>
+                        <w:rPr>
+                          <w:lang w:val="en-US"/>
+                        </w:rPr>
+                        <w:t>Enquiry</w:t>
+                      </w:r>
+                    </w:p>
+                  </w:txbxContent>
+                </v:textbox>
+                <w10:wrap anchorx="margin"/>
+              </v:shape>
+            </w:pict>
+          </mc:Fallback>
+        </mc:AlternateContent>
+      </w:r>
+    </w:p>
+    <w:p>
+      <w:pPr>
+        <w:pStyle w:val="Heading2"/>
+        <w:spacing w:before="200" w:after="120"/>
+        <w:rPr>
+          <w:rFonts w:ascii="Calibri" w:hAnsi="Calibri" w:cs="Calibri"/>
+          <w:sz w:val="22"/>
+          <w:szCs w:val="22"/>
+        </w:rPr>
+      </w:pPr>
+      <w:r>
+        <w:rPr>
+          <w:rFonts w:ascii="Calibri" w:hAnsi="Calibri" w:cs="Calibri"/>
+          <w:noProof/>
+          <w:sz w:val="22"/>
+          <w:szCs w:val="22"/>
+        </w:rPr>
+        <mc:AlternateContent>
+          <mc:Choice Requires="wps">
+            <w:drawing>
+              <wp:anchor distT="0" distB="0" distL="114300" distR="114300" simplePos="0" relativeHeight="251717120" behindDoc="0" locked="0" layoutInCell="1" allowOverlap="1" wp14:anchorId="6CD9B6B5" wp14:editId="23E7B35B">
+                <wp:simplePos x="0" y="0"/>
+                <wp:positionH relativeFrom="margin">
+                  <wp:posOffset>-129540</wp:posOffset>
+                </wp:positionH>
+                <wp:positionV relativeFrom="paragraph">
+                  <wp:posOffset>227965</wp:posOffset>
+                </wp:positionV>
+                <wp:extent cx="3878580" cy="335280"/>
+                <wp:effectExtent l="0" t="0" r="26670" b="26670"/>
+                <wp:wrapNone/>
+                <wp:docPr id="1864621153" name="Text Box 3"/>
+                <wp:cNvGraphicFramePr/>
+                <a:graphic xmlns:a="http://schemas.openxmlformats.org/drawingml/2006/main">
+                  <a:graphicData uri="http://schemas.microsoft.com/office/word/2010/wordprocessingShape">
+                    <wps:wsp>
+                      <wps:cNvSpPr txBox="1"/>
+                      <wps:spPr>
+                        <a:xfrm>
+                          <a:off x="0" y="0"/>
+                          <a:ext cx="3878580" cy="335280"/>
+                        </a:xfrm>
+                        <a:prstGeom prst="rect">
+                          <a:avLst/>
+                        </a:prstGeom>
+                        <a:solidFill>
+                          <a:schemeClr val="lt1"/>
+                        </a:solidFill>
+                        <a:ln w="6350">
+                          <a:solidFill>
+                            <a:prstClr val="black"/>
+                          </a:solidFill>
+                        </a:ln>
+                      </wps:spPr>
+                      <wps:txbx>
+                        <w:txbxContent>
+                          <w:p>
+                            <w:pPr>
+                              <w:jc w:val="center"/>
+                              <w:rPr>
+                                <w:lang w:val="en-US"/>
+                              </w:rPr>
+                            </w:pPr>
+                            <w:proofErr w:type="gramStart"/>
+                            <w:r>
+                              <w:rPr>
+                                <w:lang w:val="en-US"/>
+                              </w:rPr>
+                              <w:t>Footer(</w:t>
+                            </w:r>
+                            <w:proofErr w:type="gramEnd"/>
+                            <w:r>
+                              <w:rPr>
+                                <w:lang w:val="en-US"/>
+                              </w:rPr>
+                              <w:t>Student number)</w:t>
+                            </w:r>
+                          </w:p>
+                        </w:txbxContent>
+                      </wps:txbx>
+                      <wps:bodyPr rot="0" spcFirstLastPara="0" vertOverflow="overflow" horzOverflow="overflow" vert="horz" wrap="square" lIns="91440" tIns="45720" rIns="91440" bIns="45720" numCol="1" spcCol="0" rtlCol="0" fromWordArt="0" anchor="ctr" anchorCtr="0" forceAA="0" compatLnSpc="1">
+                        <a:prstTxWarp prst="textNoShape">
+                          <a:avLst/>
+                        </a:prstTxWarp>
+                        <a:noAutofit/>
+                      </wps:bodyPr>
+                    </wps:wsp>
+                  </a:graphicData>
+                </a:graphic>
+                <wp14:sizeRelH relativeFrom="margin">
+                  <wp14:pctWidth>0</wp14:pctWidth>
+                </wp14:sizeRelH>
+              </wp:anchor>
+            </w:drawing>
+          </mc:Choice>
+          <mc:Fallback>
+            <w:pict>
+              <v:shape w14:anchorId="6CD9B6B5" id="_x0000_s1035" type="#_x0000_t202" style="position:absolute;margin-left:-10.2pt;margin-top:17.95pt;width:305.4pt;height:26.4pt;z-index:251717120;visibility:visible;mso-wrap-style:square;mso-width-percent:0;mso-wrap-distance-left:9pt;mso-wrap-distance-top:0;mso-wrap-distance-right:9pt;mso-wrap-distance-bottom:0;mso-position-horizontal:absolute;mso-position-horizontal-relative:margin;mso-position-vertical:absolute;mso-position-vertical-relative:text;mso-width-percent:0;mso-width-relative:margin;v-text-anchor:middle" o:gfxdata="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" fillcolor="white [3201]" strokeweight=".5pt">
+                <v:textbox>
+                  <w:txbxContent>
+                    <w:p>
+                      <w:pPr>
+                        <w:jc w:val="center"/>
+                        <w:rPr>
+                          <w:lang w:val="en-US"/>
+                        </w:rPr>
+                      </w:pPr>
+                      <w:proofErr w:type="gramStart"/>
+                      <w:r>
+                        <w:rPr>
+                          <w:lang w:val="en-US"/>
+                        </w:rPr>
+                        <w:t>Footer(</w:t>
+                      </w:r>
+                      <w:proofErr w:type="gramEnd"/>
+                      <w:r>
+                        <w:rPr>
+                          <w:lang w:val="en-US"/>
+                        </w:rPr>
+                        <w:t>Student number)</w:t>
+                      </w:r>
+                    </w:p>
+                  </w:txbxContent>
+                </v:textbox>
+                <w10:wrap anchorx="margin"/>
+              </v:shape>
+            </w:pict>
+          </mc:Fallback>
+        </mc:AlternateContent>
+      </w:r>
+    </w:p>
+    <w:p>
+      <w:pPr>
+        <w:pStyle w:val="Heading2"/>
+        <w:spacing w:before="200" w:after="120"/>
+        <w:rPr>
+          <w:rFonts w:ascii="Calibri" w:hAnsi="Calibri" w:cs="Calibri"/>
+          <w:sz w:val="22"/>
+          <w:szCs w:val="22"/>
+        </w:rPr>
+      </w:pPr>
+    </w:p>
+    <w:p>
+      <w:pPr>
+        <w:pStyle w:val="Heading2"/>
+        <w:spacing w:before="200" w:after="120"/>
+        <w:rPr>
+          <w:rFonts w:ascii="Calibri" w:hAnsi="Calibri" w:cs="Calibri"/>
+          <w:sz w:val="22"/>
+          <w:szCs w:val="22"/>
+        </w:rPr>
+      </w:pPr>
+    </w:p>
+    <w:p>
+      <w:pPr>
+        <w:pStyle w:val="Heading1"/>
+        <w:spacing w:before="300" w:after="160"/>
+        <w:rPr>
+          <w:rFonts w:ascii="Calibri" w:hAnsi="Calibri" w:cs="Calibri"/>
+          <w:b/>
+          <w:bCs/>
+          <w:sz w:val="22"/>
+          <w:szCs w:val="22"/>
+        </w:rPr>
+      </w:pPr>
+    </w:p>
+    <w:p>
+      <w:pPr>
+        <w:rPr>
+          <w:color w:val="000000" w:themeColor="text1"/>
+          <w:sz w:val="32"/>
+          <w:szCs w:val="32"/>
+        </w:rPr>
+      </w:pPr>
+      <w:r>
+        <w:br w:type="page"/>
+      </w:r>
+    </w:p>
+    <w:p>
+      <w:pPr>
+        <w:pStyle w:val="Heading1"/>
+      </w:pPr>
+      <w:r>
+        <w:lastRenderedPageBreak/>
+        <w:t>T</w:t>
+      </w:r>
+      <w:r>
+        <w:t>echnical Requirements</w:t>
       </w:r>
     </w:p>
     <w:p>
@@ -439,22 +2277,15 @@
           <w:numId w:val="2"/>
         </w:numPr>
         <w:spacing w:after="80" w:line="360" w:lineRule="auto"/>
-      </w:pPr>
-      <w:r>
-        <w:t>No central place to showcase a full portfolio of past projects</w:t>
-      </w:r>
-    </w:p>
-    <w:p>
-      <w:pPr>
-        <w:pStyle w:val="Heading1"/>
-        <w:spacing w:before="300" w:after="160"/>
-      </w:pPr>
-      <w:r>
-        <w:rPr>
-          <w:b/>
-          <w:bCs/>
-        </w:rPr>
-        <w:t>4. Proposed Website Features and Functionality</w:t>
+        <w:rPr>
+          <w:rFonts w:ascii="Calibri" w:hAnsi="Calibri" w:cs="Calibri"/>
+        </w:rPr>
+      </w:pPr>
+      <w:r>
+        <w:rPr>
+          <w:rFonts w:ascii="Calibri" w:hAnsi="Calibri" w:cs="Calibri"/>
+        </w:rPr>
+        <w:t>Hosting: Shared web hosting suitable for a small business site</w:t>
       </w:r>
     </w:p>
     <w:p>
@@ -465,15 +2296,15 @@
           <w:numId w:val="2"/>
         </w:numPr>
         <w:spacing w:after="80" w:line="360" w:lineRule="auto"/>
-      </w:pPr>
-      <w:r>
-        <w:t xml:space="preserve">Homepage – introduction, </w:t>
-      </w:r>
-      <w:r>
-        <w:t xml:space="preserve"> logo </w:t>
-      </w:r>
-      <w:r>
-        <w:t>image, and clear call-to-action</w:t>
+        <w:rPr>
+          <w:rFonts w:ascii="Calibri" w:hAnsi="Calibri" w:cs="Calibri"/>
+        </w:rPr>
+      </w:pPr>
+      <w:r>
+        <w:rPr>
+          <w:rFonts w:ascii="Calibri" w:hAnsi="Calibri" w:cs="Calibri"/>
+        </w:rPr>
+        <w:t>Domain name: A .co.za (or relevant local) domain matching the business name</w:t>
       </w:r>
     </w:p>
     <w:p>
@@ -484,387 +2315,23 @@
           <w:numId w:val="2"/>
         </w:numPr>
         <w:spacing w:after="80" w:line="360" w:lineRule="auto"/>
-      </w:pPr>
-      <w:r>
-        <w:t>About Us – business history, mission, and team</w:t>
-      </w:r>
-    </w:p>
-    <w:p>
-      <w:pPr>
-        <w:pStyle w:val="ListParagraph"/>
-        <w:numPr>
-          <w:ilvl w:val="0"/>
-          <w:numId w:val="2"/>
-        </w:numPr>
-        <w:spacing w:after="80" w:line="360" w:lineRule="auto"/>
-      </w:pPr>
-      <w:r>
-        <w:t>Services – garden maintenance and garden design packages</w:t>
-      </w:r>
-    </w:p>
-    <w:p>
-      <w:pPr>
-        <w:pStyle w:val="ListParagraph"/>
-        <w:numPr>
-          <w:ilvl w:val="0"/>
-          <w:numId w:val="2"/>
-        </w:numPr>
-        <w:spacing w:after="80" w:line="360" w:lineRule="auto"/>
-      </w:pPr>
-      <w:r>
-        <w:t>Contact/– simple enquiry form with service selection</w:t>
+        <w:rPr>
+          <w:rFonts w:ascii="Calibri" w:hAnsi="Calibri" w:cs="Calibri"/>
+        </w:rPr>
+      </w:pPr>
+      <w:r>
+        <w:rPr>
+          <w:rFonts w:ascii="Calibri" w:hAnsi="Calibri" w:cs="Calibri"/>
+        </w:rPr>
+        <w:t>Languages/Frameworks: HTML, CSS, and JavaScript, with a lightweight CMS (e.g. WordPress) to allow the client to update photos and content</w:t>
       </w:r>
     </w:p>
     <w:p>
       <w:pPr>
         <w:pStyle w:val="Heading1"/>
-        <w:spacing w:before="300" w:after="160"/>
-      </w:pPr>
-      <w:r>
-        <w:rPr>
-          <w:b/>
-          <w:bCs/>
-        </w:rPr>
-        <w:t>5. Design and User Experience</w:t>
-      </w:r>
-    </w:p>
-    <w:p>
-      <w:pPr>
-        <w:pStyle w:val="ListParagraph"/>
-        <w:numPr>
-          <w:ilvl w:val="0"/>
-          <w:numId w:val="2"/>
-        </w:numPr>
-        <w:spacing w:after="80" w:line="360" w:lineRule="auto"/>
-      </w:pPr>
-      <w:r>
-        <w:t>Colour Scheme: Earthy greens and browns with</w:t>
-      </w:r>
-      <w:r>
-        <w:t xml:space="preserve"> a garden theme as a background</w:t>
-      </w:r>
-      <w:r>
-        <w:t>, reflecting a natural, garden-inspired palette</w:t>
-      </w:r>
-    </w:p>
-    <w:p>
-      <w:pPr>
-        <w:pStyle w:val="ListParagraph"/>
-        <w:numPr>
-          <w:ilvl w:val="0"/>
-          <w:numId w:val="2"/>
-        </w:numPr>
-        <w:spacing w:after="80" w:line="360" w:lineRule="auto"/>
-      </w:pPr>
-      <w:r>
-        <w:t xml:space="preserve">Typography: A clean </w:t>
-      </w:r>
-      <w:r>
-        <w:t>Palatino Linotype</w:t>
-      </w:r>
-      <w:r>
-        <w:t xml:space="preserve"> </w:t>
-      </w:r>
-      <w:r>
-        <w:t xml:space="preserve">for headings paired with a readable </w:t>
-      </w:r>
-      <w:r>
-        <w:t>Baskerville Old Face</w:t>
-      </w:r>
-      <w:r>
-        <w:t xml:space="preserve"> for the rest</w:t>
-      </w:r>
-      <w:r>
-        <w:t>, keeping a friendly, approachable hierarchy</w:t>
-      </w:r>
-    </w:p>
-    <w:p>
-      <w:pPr>
-        <w:pStyle w:val="ListParagraph"/>
-        <w:numPr>
-          <w:ilvl w:val="0"/>
-          <w:numId w:val="2"/>
-        </w:numPr>
-        <w:spacing w:after="80" w:line="360" w:lineRule="auto"/>
-      </w:pPr>
-      <w:r>
-        <w:t>Layout and Design: Simple, image-led layout with generous white space so photography of gardens remains the focus</w:t>
-      </w:r>
-    </w:p>
-    <w:p>
-      <w:pPr>
-        <w:pStyle w:val="Heading2"/>
-        <w:spacing w:before="200" w:after="120"/>
-      </w:pPr>
-      <w:r>
-        <w:rPr>
-          <w:b/>
-          <w:bCs/>
-        </w:rPr>
-        <w:t xml:space="preserve">Low-Fidelity Wireframe </w:t>
-      </w:r>
-    </w:p>
-    <w:tbl>
-      <w:tblPr>
-        <w:tblW w:w="5000" w:type="pct"/>
-        <w:tblBorders>
-          <w:top w:val="single" w:sz="4" w:space="0" w:color="auto"/>
-          <w:left w:val="single" w:sz="4" w:space="0" w:color="auto"/>
-          <w:bottom w:val="single" w:sz="4" w:space="0" w:color="auto"/>
-          <w:right w:val="single" w:sz="4" w:space="0" w:color="auto"/>
-          <w:insideH w:val="single" w:sz="4" w:space="0" w:color="auto"/>
-          <w:insideV w:val="single" w:sz="4" w:space="0" w:color="auto"/>
-        </w:tblBorders>
-        <w:tblCellMar>
-          <w:left w:w="10" w:type="dxa"/>
-          <w:right w:w="10" w:type="dxa"/>
-        </w:tblCellMar>
-        <w:tblLook w:val="0000" w:firstRow="0" w:lastRow="0" w:firstColumn="0" w:lastColumn="0" w:noHBand="0" w:noVBand="0"/>
-      </w:tblPr>
-      <w:tblGrid>
-        <w:gridCol w:w="9350"/>
-      </w:tblGrid>
-      <w:tr>
-        <w:tc>
-          <w:tcPr>
-            <w:tcW w:w="5000" w:type="pct"/>
-            <w:shd w:val="clear" w:color="auto" w:fill="D9E8D8"/>
-            <w:tcMar>
-              <w:top w:w="100" w:type="dxa"/>
-              <w:left w:w="100" w:type="dxa"/>
-              <w:bottom w:w="100" w:type="dxa"/>
-              <w:right w:w="100" w:type="dxa"/>
-            </w:tcMar>
-          </w:tcPr>
-          <w:p>
-            <w:pPr>
-              <w:jc w:val="center"/>
-            </w:pPr>
-            <w:r>
-              <w:rPr>
-                <w:b/>
-                <w:bCs/>
-              </w:rPr>
-              <w:t xml:space="preserve"> Logo / Navigation Menu</w:t>
-            </w:r>
-          </w:p>
-        </w:tc>
-      </w:tr>
-      <w:tr>
-        <w:tc>
-          <w:tcPr>
-            <w:tcW w:w="5000" w:type="pct"/>
-            <w:shd w:val="clear" w:color="auto" w:fill="C6DDC4"/>
-            <w:tcMar>
-              <w:top w:w="100" w:type="dxa"/>
-              <w:left w:w="100" w:type="dxa"/>
-              <w:bottom w:w="100" w:type="dxa"/>
-              <w:right w:w="100" w:type="dxa"/>
-            </w:tcMar>
-          </w:tcPr>
-          <w:p>
-            <w:pPr>
-              <w:jc w:val="center"/>
-            </w:pPr>
-            <w:r>
-              <w:rPr>
-                <w:b/>
-                <w:bCs/>
-              </w:rPr>
-              <w:t xml:space="preserve">+Tagline </w:t>
-            </w:r>
-          </w:p>
-        </w:tc>
-      </w:tr>
-      <w:tr>
-        <w:tc>
-          <w:tcPr>
-            <w:tcW w:w="5000" w:type="pct"/>
-            <w:shd w:val="clear" w:color="auto" w:fill="E8F0E4"/>
-            <w:tcMar>
-              <w:top w:w="100" w:type="dxa"/>
-              <w:left w:w="100" w:type="dxa"/>
-              <w:bottom w:w="100" w:type="dxa"/>
-              <w:right w:w="100" w:type="dxa"/>
-            </w:tcMar>
-          </w:tcPr>
-          <w:p>
-            <w:pPr>
-              <w:jc w:val="center"/>
-              <w:rPr>
-                <w:b/>
-                <w:bCs/>
-              </w:rPr>
-            </w:pPr>
-            <w:r>
-              <w:rPr>
-                <w:b/>
-                <w:bCs/>
-              </w:rPr>
-              <w:t xml:space="preserve">About </w:t>
-            </w:r>
-            <w:proofErr w:type="spellStart"/>
-            <w:r>
-              <w:rPr>
-                <w:b/>
-                <w:bCs/>
-              </w:rPr>
-              <w:t>Bussiness</w:t>
-            </w:r>
-            <w:proofErr w:type="spellEnd"/>
-          </w:p>
-        </w:tc>
-      </w:tr>
-      <w:tr>
-        <w:tc>
-          <w:tcPr>
-            <w:tcW w:w="5000" w:type="pct"/>
-            <w:shd w:val="clear" w:color="auto" w:fill="E8F0E4"/>
-            <w:tcMar>
-              <w:top w:w="100" w:type="dxa"/>
-              <w:left w:w="100" w:type="dxa"/>
-              <w:bottom w:w="100" w:type="dxa"/>
-              <w:right w:w="100" w:type="dxa"/>
-            </w:tcMar>
-          </w:tcPr>
-          <w:p>
-            <w:pPr>
-              <w:jc w:val="center"/>
-            </w:pPr>
-            <w:r>
-              <w:rPr>
-                <w:b/>
-                <w:bCs/>
-              </w:rPr>
-              <w:t xml:space="preserve">Services Overview </w:t>
-            </w:r>
-          </w:p>
-        </w:tc>
-      </w:tr>
-      <w:tr>
-        <w:tc>
-          <w:tcPr>
-            <w:tcW w:w="5000" w:type="pct"/>
-            <w:shd w:val="clear" w:color="auto" w:fill="C6DDC4"/>
-            <w:tcMar>
-              <w:top w:w="100" w:type="dxa"/>
-              <w:left w:w="100" w:type="dxa"/>
-              <w:bottom w:w="100" w:type="dxa"/>
-              <w:right w:w="100" w:type="dxa"/>
-            </w:tcMar>
-          </w:tcPr>
-          <w:p>
-            <w:pPr>
-              <w:jc w:val="center"/>
-            </w:pPr>
-            <w:r>
-              <w:rPr>
-                <w:b/>
-                <w:bCs/>
-              </w:rPr>
-              <w:t xml:space="preserve">Contact Details </w:t>
-            </w:r>
-          </w:p>
-        </w:tc>
-      </w:tr>
-      <w:tr>
-        <w:tc>
-          <w:tcPr>
-            <w:tcW w:w="5000" w:type="pct"/>
-            <w:shd w:val="clear" w:color="auto" w:fill="D9E8D8"/>
-            <w:tcMar>
-              <w:top w:w="100" w:type="dxa"/>
-              <w:left w:w="100" w:type="dxa"/>
-              <w:bottom w:w="100" w:type="dxa"/>
-              <w:right w:w="100" w:type="dxa"/>
-            </w:tcMar>
-          </w:tcPr>
-          <w:p>
-            <w:pPr>
-              <w:jc w:val="center"/>
-            </w:pPr>
-            <w:r>
-              <w:rPr>
-                <w:b/>
-                <w:bCs/>
-              </w:rPr>
-              <w:t xml:space="preserve">Footer </w:t>
-            </w:r>
-            <w:r>
-              <w:rPr>
-                <w:b/>
-                <w:bCs/>
-              </w:rPr>
-              <w:t>-Student number</w:t>
-            </w:r>
-          </w:p>
-        </w:tc>
-      </w:tr>
-    </w:tbl>
-    <w:p>
-      <w:pPr>
-        <w:pStyle w:val="Heading1"/>
-        <w:spacing w:before="300" w:after="160"/>
-      </w:pPr>
-      <w:r>
-        <w:rPr>
-          <w:b/>
-          <w:bCs/>
-        </w:rPr>
-        <w:t>6. Technical Requirements</w:t>
-      </w:r>
-    </w:p>
-    <w:p>
-      <w:pPr>
-        <w:pStyle w:val="ListParagraph"/>
-        <w:numPr>
-          <w:ilvl w:val="0"/>
-          <w:numId w:val="2"/>
-        </w:numPr>
-        <w:spacing w:after="80" w:line="360" w:lineRule="auto"/>
-      </w:pPr>
-      <w:r>
-        <w:t>Hosting: Shared web hosting suitable for a small business site</w:t>
-      </w:r>
-    </w:p>
-    <w:p>
-      <w:pPr>
-        <w:pStyle w:val="ListParagraph"/>
-        <w:numPr>
-          <w:ilvl w:val="0"/>
-          <w:numId w:val="2"/>
-        </w:numPr>
-        <w:spacing w:after="80" w:line="360" w:lineRule="auto"/>
-      </w:pPr>
-      <w:r>
-        <w:lastRenderedPageBreak/>
-        <w:t>Domain name: A .co.za (or relevant local) domain matching the business name</w:t>
-      </w:r>
-    </w:p>
-    <w:p>
-      <w:pPr>
-        <w:pStyle w:val="ListParagraph"/>
-        <w:numPr>
-          <w:ilvl w:val="0"/>
-          <w:numId w:val="2"/>
-        </w:numPr>
-        <w:spacing w:after="80" w:line="360" w:lineRule="auto"/>
-      </w:pPr>
-      <w:r>
-        <w:t>Languages/Frameworks: HTML, CSS, and JavaScript, with a lightweight CMS (e.g. WordPress) to allow the client to update photos and content</w:t>
-      </w:r>
-    </w:p>
-    <w:p>
-      <w:pPr>
-        <w:pStyle w:val="Heading1"/>
-        <w:spacing w:before="300" w:after="160"/>
-      </w:pPr>
-      <w:r>
-        <w:rPr>
-          <w:b/>
-          <w:bCs/>
-        </w:rPr>
-        <w:t>7. Timeline and Milestones</w:t>
+      </w:pPr>
+      <w:r>
+        <w:t>Timeline and Milestones</w:t>
       </w:r>
     </w:p>
     <w:tbl>
@@ -900,9 +2367,13 @@
           <w:p>
             <w:pPr>
               <w:spacing w:line="360" w:lineRule="auto"/>
+              <w:rPr>
+                <w:rFonts w:ascii="Calibri" w:hAnsi="Calibri" w:cs="Calibri"/>
+              </w:rPr>
             </w:pPr>
             <w:r>
               <w:rPr>
+                <w:rFonts w:ascii="Calibri" w:hAnsi="Calibri" w:cs="Calibri"/>
                 <w:b/>
                 <w:bCs/>
               </w:rPr>
@@ -918,9 +2389,13 @@
           <w:p>
             <w:pPr>
               <w:spacing w:line="360" w:lineRule="auto"/>
+              <w:rPr>
+                <w:rFonts w:ascii="Calibri" w:hAnsi="Calibri" w:cs="Calibri"/>
+              </w:rPr>
             </w:pPr>
             <w:r>
               <w:rPr>
+                <w:rFonts w:ascii="Calibri" w:hAnsi="Calibri" w:cs="Calibri"/>
                 <w:b/>
                 <w:bCs/>
               </w:rPr>
@@ -937,8 +2412,14 @@
           <w:p>
             <w:pPr>
               <w:spacing w:line="360" w:lineRule="auto"/>
+              <w:rPr>
+                <w:rFonts w:ascii="Calibri" w:hAnsi="Calibri" w:cs="Calibri"/>
+              </w:rPr>
             </w:pPr>
             <w:r>
+              <w:rPr>
+                <w:rFonts w:ascii="Calibri" w:hAnsi="Calibri" w:cs="Calibri"/>
+              </w:rPr>
               <w:t>Proposal &amp; research</w:t>
             </w:r>
           </w:p>
@@ -950,8 +2431,14 @@
           <w:p>
             <w:pPr>
               <w:spacing w:line="360" w:lineRule="auto"/>
+              <w:rPr>
+                <w:rFonts w:ascii="Calibri" w:hAnsi="Calibri" w:cs="Calibri"/>
+              </w:rPr>
             </w:pPr>
             <w:r>
+              <w:rPr>
+                <w:rFonts w:ascii="Calibri" w:hAnsi="Calibri" w:cs="Calibri"/>
+              </w:rPr>
               <w:t>Week 1</w:t>
             </w:r>
           </w:p>
@@ -965,8 +2452,14 @@
           <w:p>
             <w:pPr>
               <w:spacing w:line="360" w:lineRule="auto"/>
+              <w:rPr>
+                <w:rFonts w:ascii="Calibri" w:hAnsi="Calibri" w:cs="Calibri"/>
+              </w:rPr>
             </w:pPr>
             <w:r>
+              <w:rPr>
+                <w:rFonts w:ascii="Calibri" w:hAnsi="Calibri" w:cs="Calibri"/>
+              </w:rPr>
               <w:t>Wireframes &amp; design</w:t>
             </w:r>
           </w:p>
@@ -978,8 +2471,14 @@
           <w:p>
             <w:pPr>
               <w:spacing w:line="360" w:lineRule="auto"/>
+              <w:rPr>
+                <w:rFonts w:ascii="Calibri" w:hAnsi="Calibri" w:cs="Calibri"/>
+              </w:rPr>
             </w:pPr>
             <w:r>
+              <w:rPr>
+                <w:rFonts w:ascii="Calibri" w:hAnsi="Calibri" w:cs="Calibri"/>
+              </w:rPr>
               <w:t>Week 2–3</w:t>
             </w:r>
           </w:p>
@@ -993,8 +2492,14 @@
           <w:p>
             <w:pPr>
               <w:spacing w:line="360" w:lineRule="auto"/>
+              <w:rPr>
+                <w:rFonts w:ascii="Calibri" w:hAnsi="Calibri" w:cs="Calibri"/>
+              </w:rPr>
             </w:pPr>
             <w:r>
+              <w:rPr>
+                <w:rFonts w:ascii="Calibri" w:hAnsi="Calibri" w:cs="Calibri"/>
+              </w:rPr>
               <w:t>Development (HTML/CSS/JS)</w:t>
             </w:r>
           </w:p>
@@ -1006,8 +2511,14 @@
           <w:p>
             <w:pPr>
               <w:spacing w:line="360" w:lineRule="auto"/>
+              <w:rPr>
+                <w:rFonts w:ascii="Calibri" w:hAnsi="Calibri" w:cs="Calibri"/>
+              </w:rPr>
             </w:pPr>
             <w:r>
+              <w:rPr>
+                <w:rFonts w:ascii="Calibri" w:hAnsi="Calibri" w:cs="Calibri"/>
+              </w:rPr>
               <w:t>Week 4–6</w:t>
             </w:r>
           </w:p>
@@ -1021,8 +2532,14 @@
           <w:p>
             <w:pPr>
               <w:spacing w:line="360" w:lineRule="auto"/>
+              <w:rPr>
+                <w:rFonts w:ascii="Calibri" w:hAnsi="Calibri" w:cs="Calibri"/>
+              </w:rPr>
             </w:pPr>
             <w:r>
+              <w:rPr>
+                <w:rFonts w:ascii="Calibri" w:hAnsi="Calibri" w:cs="Calibri"/>
+              </w:rPr>
               <w:t>Testing &amp; content upload</w:t>
             </w:r>
           </w:p>
@@ -1034,8 +2551,14 @@
           <w:p>
             <w:pPr>
               <w:spacing w:line="360" w:lineRule="auto"/>
+              <w:rPr>
+                <w:rFonts w:ascii="Calibri" w:hAnsi="Calibri" w:cs="Calibri"/>
+              </w:rPr>
             </w:pPr>
             <w:r>
+              <w:rPr>
+                <w:rFonts w:ascii="Calibri" w:hAnsi="Calibri" w:cs="Calibri"/>
+              </w:rPr>
               <w:t>Week 7</w:t>
             </w:r>
           </w:p>
@@ -1049,8 +2572,14 @@
           <w:p>
             <w:pPr>
               <w:spacing w:line="360" w:lineRule="auto"/>
+              <w:rPr>
+                <w:rFonts w:ascii="Calibri" w:hAnsi="Calibri" w:cs="Calibri"/>
+              </w:rPr>
             </w:pPr>
             <w:r>
+              <w:rPr>
+                <w:rFonts w:ascii="Calibri" w:hAnsi="Calibri" w:cs="Calibri"/>
+              </w:rPr>
               <w:t>Launch</w:t>
             </w:r>
           </w:p>
@@ -1062,8 +2591,14 @@
           <w:p>
             <w:pPr>
               <w:spacing w:line="360" w:lineRule="auto"/>
+              <w:rPr>
+                <w:rFonts w:ascii="Calibri" w:hAnsi="Calibri" w:cs="Calibri"/>
+              </w:rPr>
             </w:pPr>
             <w:r>
+              <w:rPr>
+                <w:rFonts w:ascii="Calibri" w:hAnsi="Calibri" w:cs="Calibri"/>
+              </w:rPr>
               <w:t>Week 8</w:t>
             </w:r>
           </w:p>
@@ -1073,19 +2608,17 @@
     <w:p>
       <w:pPr>
         <w:spacing w:before="200"/>
+        <w:rPr>
+          <w:rFonts w:ascii="Calibri" w:hAnsi="Calibri" w:cs="Calibri"/>
+        </w:rPr>
       </w:pPr>
     </w:p>
     <w:p>
       <w:pPr>
         <w:pStyle w:val="Heading1"/>
-        <w:spacing w:before="300" w:after="160"/>
-      </w:pPr>
-      <w:r>
-        <w:rPr>
-          <w:b/>
-          <w:bCs/>
-        </w:rPr>
-        <w:t>8. Budget</w:t>
+      </w:pPr>
+      <w:r>
+        <w:t xml:space="preserve"> Budget</w:t>
       </w:r>
     </w:p>
     <w:p>
@@ -1096,8 +2629,14 @@
           <w:numId w:val="2"/>
         </w:numPr>
         <w:spacing w:after="80" w:line="360" w:lineRule="auto"/>
-      </w:pPr>
-      <w:r>
+        <w:rPr>
+          <w:rFonts w:ascii="Calibri" w:hAnsi="Calibri" w:cs="Calibri"/>
+        </w:rPr>
+      </w:pPr>
+      <w:r>
+        <w:rPr>
+          <w:rFonts w:ascii="Calibri" w:hAnsi="Calibri" w:cs="Calibri"/>
+        </w:rPr>
         <w:t>Domain name registration: approx. R150–R250 per year</w:t>
       </w:r>
     </w:p>
@@ -1109,8 +2648,14 @@
           <w:numId w:val="2"/>
         </w:numPr>
         <w:spacing w:after="80" w:line="360" w:lineRule="auto"/>
-      </w:pPr>
-      <w:r>
+        <w:rPr>
+          <w:rFonts w:ascii="Calibri" w:hAnsi="Calibri" w:cs="Calibri"/>
+        </w:rPr>
+      </w:pPr>
+      <w:r>
+        <w:rPr>
+          <w:rFonts w:ascii="Calibri" w:hAnsi="Calibri" w:cs="Calibri"/>
+        </w:rPr>
         <w:t>Shared hosting: approx. R100–R200 per month</w:t>
       </w:r>
     </w:p>
@@ -1122,8 +2667,14 @@
           <w:numId w:val="2"/>
         </w:numPr>
         <w:spacing w:after="80" w:line="360" w:lineRule="auto"/>
-      </w:pPr>
-      <w:r>
+        <w:rPr>
+          <w:rFonts w:ascii="Calibri" w:hAnsi="Calibri" w:cs="Calibri"/>
+        </w:rPr>
+      </w:pPr>
+      <w:r>
+        <w:rPr>
+          <w:rFonts w:ascii="Calibri" w:hAnsi="Calibri" w:cs="Calibri"/>
+        </w:rPr>
         <w:t>Website design &amp; development: approx. R5,000–R8,000 (once-off, student/freelance rate)</w:t>
       </w:r>
     </w:p>
@@ -1135,9 +2686,23 @@
           <w:numId w:val="2"/>
         </w:numPr>
         <w:spacing w:after="80" w:line="360" w:lineRule="auto"/>
-      </w:pPr>
-      <w:r>
+        <w:rPr>
+          <w:rFonts w:ascii="Calibri" w:hAnsi="Calibri" w:cs="Calibri"/>
+        </w:rPr>
+      </w:pPr>
+      <w:r>
+        <w:rPr>
+          <w:rFonts w:ascii="Calibri" w:hAnsi="Calibri" w:cs="Calibri"/>
+        </w:rPr>
         <w:t>Ongoing maintenance &amp; updates: approx. R300–R500 per month</w:t>
+      </w:r>
+    </w:p>
+    <w:p>
+      <w:pPr>
+        <w:pStyle w:val="Heading1"/>
+      </w:pPr>
+      <w:r>
+        <w:t>References</w:t>
       </w:r>
     </w:p>
     <w:p>
@@ -1145,27 +2710,56 @@
         <w:pStyle w:val="Heading1"/>
         <w:spacing w:before="300" w:after="160"/>
         <w:rPr>
+          <w:rFonts w:ascii="Calibri" w:hAnsi="Calibri" w:cs="Calibri"/>
           <w:b/>
           <w:bCs/>
-        </w:rPr>
-      </w:pPr>
-      <w:r>
-        <w:rPr>
+          <w:color w:val="auto"/>
+          <w:sz w:val="22"/>
+          <w:szCs w:val="22"/>
+        </w:rPr>
+      </w:pPr>
+      <w:proofErr w:type="spellStart"/>
+      <w:r>
+        <w:rPr>
+          <w:rFonts w:ascii="Calibri" w:hAnsi="Calibri" w:cs="Calibri"/>
           <w:b/>
           <w:bCs/>
-        </w:rPr>
-        <w:t>9. References</w:t>
+          <w:color w:val="auto"/>
+          <w:sz w:val="22"/>
+          <w:szCs w:val="22"/>
+        </w:rPr>
+        <w:t>Inspriation</w:t>
+      </w:r>
+      <w:proofErr w:type="spellEnd"/>
+      <w:r>
+        <w:rPr>
+          <w:rFonts w:ascii="Calibri" w:hAnsi="Calibri" w:cs="Calibri"/>
+          <w:b/>
+          <w:bCs/>
+          <w:color w:val="auto"/>
+          <w:sz w:val="22"/>
+          <w:szCs w:val="22"/>
+        </w:rPr>
+        <w:t>-</w:t>
       </w:r>
     </w:p>
     <w:p>
       <w:pPr>
         <w:pStyle w:val="Heading1"/>
         <w:spacing w:before="300" w:after="160"/>
-      </w:pPr>
-      <w:hyperlink r:id="rId5" w:history="1">
+        <w:rPr>
+          <w:rFonts w:ascii="Calibri" w:hAnsi="Calibri" w:cs="Calibri"/>
+          <w:sz w:val="22"/>
+          <w:szCs w:val="22"/>
+        </w:rPr>
+      </w:pPr>
+      <w:hyperlink r:id="rId6" w:history="1">
         <w:r>
           <w:rPr>
             <w:rStyle w:val="Hyperlink"/>
+            <w:rFonts w:ascii="Calibri" w:hAnsi="Calibri" w:cs="Calibri"/>
+            <w:sz w:val="22"/>
+            <w:szCs w:val="22"/>
           </w:rPr>
           <w:t>https://lifestyle.co.za/?srsltid=AfmBOooDEwHAZx6Sxh3kyTRpnQKxPgGKoxcfeOCRTpvV8va8c27Sfs_2</w:t>
         </w:r>
@@ -1175,30 +2769,150 @@
       <w:pPr>
         <w:pStyle w:val="Heading1"/>
         <w:spacing w:before="300" w:after="160"/>
-      </w:pPr>
-      <w:r>
-        <w:t>https://www.growthpulsemedia.co.za/website-cost-south-africa/</w:t>
+        <w:rPr>
+          <w:rFonts w:ascii="Calibri" w:hAnsi="Calibri" w:cs="Calibri"/>
+          <w:b/>
+          <w:bCs/>
+          <w:color w:val="auto"/>
+          <w:sz w:val="22"/>
+          <w:szCs w:val="22"/>
+        </w:rPr>
+      </w:pPr>
+      <w:proofErr w:type="spellStart"/>
+      <w:r>
+        <w:rPr>
+          <w:rFonts w:ascii="Calibri" w:hAnsi="Calibri" w:cs="Calibri"/>
+          <w:b/>
+          <w:bCs/>
+          <w:color w:val="auto"/>
+          <w:sz w:val="22"/>
+          <w:szCs w:val="22"/>
+        </w:rPr>
+        <w:t>Buguet</w:t>
+      </w:r>
+      <w:proofErr w:type="spellEnd"/>
+      <w:r>
+        <w:rPr>
+          <w:rFonts w:ascii="Calibri" w:hAnsi="Calibri" w:cs="Calibri"/>
+          <w:b/>
+          <w:bCs/>
+          <w:color w:val="auto"/>
+          <w:sz w:val="22"/>
+          <w:szCs w:val="22"/>
+        </w:rPr>
+        <w:t>-</w:t>
       </w:r>
     </w:p>
     <w:p>
       <w:pPr>
         <w:pStyle w:val="Heading1"/>
         <w:spacing w:before="300" w:after="160"/>
-      </w:pPr>
-      <w:r>
-        <w:t>logo-</w:t>
-      </w:r>
-      <w:r>
-        <w:t>https://www.canva.com/design/DAHRg61_xCs/NPJQEmo1TPmjTWxRkcUhEw/edit?ui=e30</w:t>
+        <w:rPr>
+          <w:rFonts w:ascii="Calibri" w:hAnsi="Calibri" w:cs="Calibri"/>
+          <w:sz w:val="22"/>
+          <w:szCs w:val="22"/>
+        </w:rPr>
+      </w:pPr>
+      <w:r>
+        <w:rPr>
+          <w:rFonts w:ascii="Calibri" w:hAnsi="Calibri" w:cs="Calibri"/>
+          <w:sz w:val="22"/>
+          <w:szCs w:val="22"/>
+        </w:rPr>
+        <w:t>https://www.growthpulsemedia.co.za/website-cost-south-africa/</w:t>
       </w:r>
     </w:p>
     <w:p>
       <w:pPr>
         <w:pStyle w:val="Heading1"/>
         <w:spacing w:before="300" w:after="160"/>
-      </w:pPr>
-      <w:r>
-        <w:t>https://www.canva.com/design/DAHR4oGIv4U/BOYnGqagVAxIVH3rgSGMlQ/edit</w:t>
+        <w:rPr>
+          <w:rFonts w:ascii="Calibri" w:hAnsi="Calibri" w:cs="Calibri"/>
+          <w:sz w:val="22"/>
+          <w:szCs w:val="22"/>
+        </w:rPr>
+      </w:pPr>
+      <w:r>
+        <w:rPr>
+          <w:rFonts w:ascii="Calibri" w:hAnsi="Calibri" w:cs="Calibri"/>
+          <w:b/>
+          <w:bCs/>
+          <w:color w:val="auto"/>
+          <w:sz w:val="22"/>
+          <w:szCs w:val="22"/>
+        </w:rPr>
+        <w:t>logo-</w:t>
+      </w:r>
+      <w:r>
+        <w:rPr>
+          <w:rFonts w:ascii="Calibri" w:hAnsi="Calibri" w:cs="Calibri"/>
+          <w:sz w:val="22"/>
+          <w:szCs w:val="22"/>
+        </w:rPr>
+        <w:t>https://www.canva.com/design/DAHRg61_xCs/NPJQEmo1TPmjTWxRkcUhEw/edit?ui=e30</w:t>
+      </w:r>
+    </w:p>
+    <w:p>
+      <w:pPr>
+        <w:pStyle w:val="Heading1"/>
+        <w:spacing w:before="300" w:after="160"/>
+        <w:rPr>
+          <w:rFonts w:ascii="Calibri" w:hAnsi="Calibri" w:cs="Calibri"/>
+          <w:b/>
+          <w:bCs/>
+          <w:color w:val="auto"/>
+          <w:sz w:val="22"/>
+          <w:szCs w:val="22"/>
+        </w:rPr>
+      </w:pPr>
+      <w:proofErr w:type="spellStart"/>
+      <w:r>
+        <w:rPr>
+          <w:rFonts w:ascii="Calibri" w:hAnsi="Calibri" w:cs="Calibri"/>
+          <w:b/>
+          <w:bCs/>
+          <w:color w:val="auto"/>
+          <w:sz w:val="22"/>
+          <w:szCs w:val="22"/>
+        </w:rPr>
+        <w:t>Github</w:t>
+      </w:r>
+      <w:proofErr w:type="spellEnd"/>
+      <w:r>
+        <w:rPr>
+          <w:rFonts w:ascii="Calibri" w:hAnsi="Calibri" w:cs="Calibri"/>
+          <w:b/>
+          <w:bCs/>
+          <w:color w:val="auto"/>
+          <w:sz w:val="22"/>
+          <w:szCs w:val="22"/>
+        </w:rPr>
+        <w:t>-</w:t>
+      </w:r>
+    </w:p>
+    <w:p>
+      <w:pPr>
+        <w:pStyle w:val="Heading1"/>
+        <w:spacing w:before="300" w:after="160"/>
+        <w:rPr>
+          <w:sz w:val="22"/>
+          <w:szCs w:val="22"/>
+        </w:rPr>
+      </w:pPr>
+      <w:r>
+        <w:rPr>
+          <w:rFonts w:ascii="Calibri" w:hAnsi="Calibri" w:cs="Calibri"/>
+          <w:sz w:val="22"/>
+          <w:szCs w:val="22"/>
+        </w:rPr>
+        <w:t>https://github.com/ariana-c</w:t>
+      </w:r>
+      <w:r>
+        <w:rPr>
+          <w:sz w:val="22"/>
+          <w:szCs w:val="22"/>
+        </w:rPr>
+        <w:t>ode07/Gloriosa-Gardens.git</w:t>
       </w:r>
     </w:p>
     <w:sectPr>
@@ -1212,7 +2926,7 @@
 </file>
 
 <file path=word/numbering.xml><?xml version="1.0" encoding="utf-8"?>
-<w:numbering xmlns:wpc="http://schemas.microsoft.com/office/word/2010/wordprocessingCanvas" xmlns:cx="http://schemas.microsoft.com/office/drawing/2014/chartex" xmlns:cx1="http://schemas.microsoft.com/office/drawing/2015/9/8/chartex" xmlns:cx2="http://schemas.microsoft.com/office/drawing/2015/10/21/chartex" xmlns:cx3="http://schemas.microsoft.com/office/drawing/2016/5/9/chartex" xmlns:cx4="http://schemas.microsoft.com/office/drawing/2016/5/10/chartex" xmlns:cx5="http://schemas.microsoft.com/office/drawing/2016/5/11/chartex" xmlns:cx6="http://schemas.microsoft.com/office/drawing/2016/5/12/chartex" xmlns:cx7="http://schemas.microsoft.com/office/drawing/2016/5/13/chartex" xmlns:cx8="http://schemas.microsoft.com/office/drawing/2016/5/14/chartex" xmlns:mc="http://schemas.openxmlformats.org/markup-compatibility/2006" xmlns:aink="http://schemas.microsoft.com/office/drawing/2016/ink" xmlns:am3d="http://schemas.microsoft.com/office/drawing/2017/model3d" xmlns:o="urn:schemas-microsoft-com:office:office" xmlns:oel="http://schemas.microsoft.com/office/2019/extlst" xmlns:r="http://schemas.openxmlformats.org/officeDocument/2006/relationships" xmlns:m="http://schemas.openxmlformats.org/officeDocument/2006/math" xmlns:v="urn:schemas-microsoft-com:vml" xmlns:wp14="http://schemas.microsoft.com/office/word/2010/wordprocessingDrawing" xmlns:wp="http://schemas.openxmlformats.org/drawingml/2006/wordprocessingDrawing" xmlns:w10="urn:schemas-microsoft-com:office:word" xmlns:w="http://schemas.openxmlformats.org/wordprocessingml/2006/main" xmlns:w14="http://schemas.microsoft.com/office/word/2010/wordml" xmlns:w15="http://schemas.microsoft.com/office/word/2012/wordml" xmlns:w16cei="http://schemas.microsoft.com/office/word/2026/wordml/cei" xmlns:w16cex="http://schemas.microsoft.com/office/word/2018/wordml/cex" xmlns:w16cid="http://schemas.microsoft.com/office/word/2016/wordml/cid" xmlns:w16="http://schemas.microsoft.com/office/word/2018/wordml" xmlns:w16du="http://schemas.microsoft.com/office/word/2023/wordml/word16du" xmlns:w16sdtdh="http://schemas.microsoft.com/office/word/2020/wordml/sdtdatahash" xmlns:w16sdtfl="http://schemas.microsoft.com/office/word/2024/wordml/sdtformatlock" xmlns:w16se="http://schemas.microsoft.com/office/word/2015/wordml/symex" xmlns:wpg="http://schemas.microsoft.com/office/word/2010/wordprocessingGroup" xmlns:wpi="http://schemas.microsoft.com/office/word/2010/wordprocessingInk" xmlns:wne="http://schemas.microsoft.com/office/word/2006/wordml" xmlns:wps="http://schemas.microsoft.com/office/word/2010/wordprocessingShape" mc:Ignorable="w14 w15 w16se w16cid w16 w16cex w16sdtdh w16sdtfl w16du wp14">
+<w:numbering xmlns:wpc="http://schemas.microsoft.com/office/word/2010/wordprocessingCanvas" xmlns:cx="http://schemas.microsoft.com/office/drawing/2014/chartex" xmlns:cx1="http://schemas.microsoft.com/office/drawing/2015/9/8/chartex" xmlns:cx2="http://schemas.microsoft.com/office/drawing/2015/10/21/chartex" xmlns:cx3="http://schemas.microsoft.com/office/drawing/2016/5/9/chartex" xmlns:cx4="http://schemas.microsoft.com/office/drawing/2016/5/10/chartex" xmlns:cx5="http://schemas.microsoft.com/office/drawing/2016/5/11/chartex" xmlns:cx6="http://schemas.microsoft.com/office/drawing/2016/5/12/chartex" xmlns:cx7="http://schemas.microsoft.com/office/drawing/2016/5/13/chartex" xmlns:cx8="http://schemas.microsoft.com/office/drawing/2016/5/14/chartex" xmlns:mc="http://schemas.openxmlformats.org/markup-compatibility/2006" xmlns:aink="http://schemas.microsoft.com/office/drawing/2016/ink" xmlns:am3d="http://schemas.microsoft.com/office/drawing/2017/model3d" xmlns:o="urn:schemas-microsoft-com:office:office" xmlns:oel="http://schemas.microsoft.com/office/2019/extlst" xmlns:r="http://schemas.openxmlformats.org/officeDocument/2006/relationships" xmlns:m="http://schemas.openxmlformats.org/officeDocument/2006/math" xmlns:v="urn:schemas-microsoft-com:vml" xmlns:wp14="http://schemas.microsoft.com/office/word/2010/wordprocessingDrawing" xmlns:wp="http://schemas.openxmlformats.org/drawingml/2006/wordprocessingDrawing" xmlns:w10="urn:schemas-microsoft-com:office:word" xmlns:w="http://schemas.openxmlformats.org/wordprocessingml/2006/main" xmlns:w14="http://schemas.microsoft.com/office/word/2010/wordml" xmlns:w15="http://schemas.microsoft.com/office/word/2012/wordml" xmlns:w16cex="http://schemas.microsoft.com/office/word/2018/wordml/cex" xmlns:w16cid="http://schemas.microsoft.com/office/word/2016/wordml/cid" xmlns:w16="http://schemas.microsoft.com/office/word/2018/wordml" xmlns:w16du="http://schemas.microsoft.com/office/word/2023/wordml/word16du" xmlns:w16sdtdh="http://schemas.microsoft.com/office/word/2020/wordml/sdtdatahash" xmlns:w16sdtfl="http://schemas.microsoft.com/office/word/2024/wordml/sdtformatlock" xmlns:w16se="http://schemas.microsoft.com/office/word/2015/wordml/symex" xmlns:wpg="http://schemas.microsoft.com/office/word/2010/wordprocessingGroup" xmlns:wpi="http://schemas.microsoft.com/office/word/2010/wordprocessingInk" xmlns:wne="http://schemas.microsoft.com/office/word/2006/wordml" xmlns:wps="http://schemas.microsoft.com/office/word/2010/wordprocessingShape" mc:Ignorable="w14 w15 w16se w16cid w16 w16cex w16sdtdh w16sdtfl w16du wp14">
   <w:abstractNum w:abstractNumId="0" w15:restartNumberingAfterBreak="0">
     <w:nsid w:val="20FB0091"/>
     <w:multiLevelType w:val="hybridMultilevel"/>
@@ -1357,6 +3071,125 @@
       </w:pPr>
     </w:lvl>
   </w:abstractNum>
+  <w:abstractNum w:abstractNumId="2" w15:restartNumberingAfterBreak="0">
+    <w:nsid w:val="64777183"/>
+    <w:multiLevelType w:val="multilevel"/>
+    <w:tmpl w:val="E3CE08BA"/>
+    <w:lvl w:ilvl="0">
+      <w:start w:val="1"/>
+      <w:numFmt w:val="bullet"/>
+      <w:lvlText w:val=""/>
+      <w:lvlJc w:val="left"/>
+      <w:pPr>
+        <w:tabs>
+          <w:tab w:val="num" w:pos="0"/>
+        </w:tabs>
+        <w:ind w:left="420" w:hanging="260"/>
+      </w:pPr>
+      <w:rPr>
+        <w:rFonts w:ascii="Symbol" w:hAnsi="Symbol" w:cs="Symbol" w:hint="default"/>
+      </w:rPr>
+    </w:lvl>
+    <w:lvl w:ilvl="1">
+      <w:start w:val="1"/>
+      <w:numFmt w:val="bullet"/>
+      <w:lvlText w:val="◦"/>
+      <w:lvlJc w:val="left"/>
+      <w:pPr>
+        <w:tabs>
+          <w:tab w:val="num" w:pos="0"/>
+        </w:tabs>
+        <w:ind w:left="820" w:hanging="260"/>
+      </w:pPr>
+      <w:rPr>
+        <w:rFonts w:ascii="OpenSymbol" w:hAnsi="OpenSymbol" w:cs="OpenSymbol" w:hint="default"/>
+      </w:rPr>
+    </w:lvl>
+    <w:lvl w:ilvl="2">
+      <w:start w:val="1"/>
+      <w:numFmt w:val="decimal"/>
+      <w:lvlText w:val="%3."/>
+      <w:lvlJc w:val="left"/>
+      <w:pPr>
+        <w:tabs>
+          <w:tab w:val="num" w:pos="1440"/>
+        </w:tabs>
+        <w:ind w:left="1440" w:hanging="360"/>
+      </w:pPr>
+    </w:lvl>
+    <w:lvl w:ilvl="3">
+      <w:start w:val="1"/>
+      <w:numFmt w:val="decimal"/>
+      <w:lvlText w:val="%4."/>
+      <w:lvlJc w:val="left"/>
+      <w:pPr>
+        <w:tabs>
+          <w:tab w:val="num" w:pos="1800"/>
+        </w:tabs>
+        <w:ind w:left="1800" w:hanging="360"/>
+      </w:pPr>
+    </w:lvl>
+    <w:lvl w:ilvl="4">
+      <w:start w:val="1"/>
+      <w:numFmt w:val="decimal"/>
+      <w:lvlText w:val="%5."/>
+      <w:lvlJc w:val="left"/>
+      <w:pPr>
+        <w:tabs>
+          <w:tab w:val="num" w:pos="2160"/>
+        </w:tabs>
+        <w:ind w:left="2160" w:hanging="360"/>
+      </w:pPr>
+    </w:lvl>
+    <w:lvl w:ilvl="5">
+      <w:start w:val="1"/>
+      <w:numFmt w:val="decimal"/>
+      <w:lvlText w:val="%6."/>
+      <w:lvlJc w:val="left"/>
+      <w:pPr>
+        <w:tabs>
+          <w:tab w:val="num" w:pos="2520"/>
+        </w:tabs>
+        <w:ind w:left="2520" w:hanging="360"/>
+      </w:pPr>
+    </w:lvl>
+    <w:lvl w:ilvl="6">
+      <w:start w:val="1"/>
+      <w:numFmt w:val="decimal"/>
+      <w:lvlText w:val="%7."/>
+      <w:lvlJc w:val="left"/>
+      <w:pPr>
+        <w:tabs>
+          <w:tab w:val="num" w:pos="2880"/>
+        </w:tabs>
+        <w:ind w:left="2880" w:hanging="360"/>
+      </w:pPr>
+    </w:lvl>
+    <w:lvl w:ilvl="7">
+      <w:start w:val="1"/>
+      <w:numFmt w:val="decimal"/>
+      <w:lvlText w:val="%8."/>
+      <w:lvlJc w:val="left"/>
+      <w:pPr>
+        <w:tabs>
+          <w:tab w:val="num" w:pos="3240"/>
+        </w:tabs>
+        <w:ind w:left="3240" w:hanging="360"/>
+      </w:pPr>
+    </w:lvl>
+    <w:lvl w:ilvl="8">
+      <w:start w:val="1"/>
+      <w:numFmt w:val="decimal"/>
+      <w:lvlText w:val="%9."/>
+      <w:lvlJc w:val="left"/>
+      <w:pPr>
+        <w:tabs>
+          <w:tab w:val="num" w:pos="3600"/>
+        </w:tabs>
+        <w:ind w:left="3600" w:hanging="360"/>
+      </w:pPr>
+    </w:lvl>
+  </w:abstractNum>
   <w:num w:numId="1" w16cid:durableId="970210593">
     <w:abstractNumId w:val="1"/>
     <w:lvlOverride w:ilvl="0">
@@ -1368,6 +3201,9 @@
     <w:lvlOverride w:ilvl="0">
       <w:startOverride w:val="1"/>
     </w:lvlOverride>
+  </w:num>
+  <w:num w:numId="3" w16cid:durableId="1940016522">
+    <w:abstractNumId w:val="2"/>
   </w:num>
 </w:numbering>
 </file>
@@ -1771,11 +3607,12 @@
     <w:name w:val="heading 1"/>
     <w:uiPriority w:val="9"/>
     <w:qFormat/>
+    <w:rsid w:val="007E393C"/>
     <w:pPr>
       <w:outlineLvl w:val="0"/>
     </w:pPr>
     <w:rPr>
-      <w:color w:val="2E74B5"/>
+      <w:color w:val="000000" w:themeColor="text1"/>
       <w:sz w:val="32"/>
       <w:szCs w:val="32"/>
     </w:rPr>
@@ -1785,11 +3622,12 @@
     <w:uiPriority w:val="9"/>
     <w:unhideWhenUsed/>
     <w:qFormat/>
+    <w:rsid w:val="007E393C"/>
     <w:pPr>
       <w:outlineLvl w:val="1"/>
     </w:pPr>
     <w:rPr>
-      <w:color w:val="2E74B5"/>
+      <w:color w:val="000000" w:themeColor="text1"/>
       <w:sz w:val="26"/>
       <w:szCs w:val="26"/>
     </w:rPr>
@@ -1797,7 +3635,6 @@
   <w:style w:type="paragraph" w:styleId="Heading3">
     <w:name w:val="heading 3"/>
     <w:uiPriority w:val="9"/>
-    <w:semiHidden/>
     <w:unhideWhenUsed/>
     <w:qFormat/>
     <w:pPr>
@@ -2297,4 +4134,16 @@
     </a:ext>
   </a:extLst>
 </a:theme>
+</file>
+
+<file path=customXml/item1.xml><?xml version="1.0" encoding="utf-8"?>
+<b:Sources xmlns:b="http://schemas.openxmlformats.org/officeDocument/2006/bibliography" xmlns="http://schemas.openxmlformats.org/officeDocument/2006/bibliography" SelectedStyle="\APASixthEditionOfficeOnline.xsl" StyleName="APA" Version="6"/>
+</file>
+
+<file path=customXml/itemProps1.xml><?xml version="1.0" encoding="utf-8"?>
+<ds:datastoreItem xmlns:ds="http://schemas.openxmlformats.org/officeDocument/2006/customXml" ds:itemID="{249018A4-A55D-4DB3-A014-B4D732C72AC7}">
+  <ds:schemaRefs>
+    <ds:schemaRef ds:uri="http://schemas.openxmlformats.org/officeDocument/2006/bibliography"/>
+  </ds:schemaRefs>
+</ds:datastoreItem>
 </file>
</xml_diff>